<commit_message>
docs(c1a): G0 giả thuyết + G3 cỡ mẫu theo độ chính xác có hiệu chỉnh cụm + SAP §12 — áp quyết định PI 07/10
PI chốt 07/10/2026: N = 1000 là cỡ mẫu của nghiên cứu; C1a có 50 bàn khám.
- study_meta.gate_params.G0: H0/H1 + chiều kỳ vọng (Quyen 2021, PMID 34017606) theo trả lời DP-G0-1.
- gate_params.G3 ghim khung độ chính xác: p 0,50 · d ±5% · ICC 0,02 (Adams 2004, PMID 15485730)
  · cỡ chùm 20; powered_for_outcome trùng tên kết cục chính G1.
- G3 sinh lại: N cần 532, bù 15% không trả lời ⇒ 626; N chốt 1000 ≥ 626 (ĐẠT).
- SAP §12 ghi N hiệu lực và khung «chinh_xac».
Mọi cờ xác nhận của PI (reviewed_at, *_confirmed, dau_van_tay_chot) GIỮ NGUYÊN — không ghi thay.
Trạng thái vẫn DRAFT — CHỜ BÁC SĨ XÁC NHẬN.

Co-Authored-By: Claude Opus 5.5 <noreply@anthropic.com>
</commit_message>
<xml_diff>
--- a/exports/hai-long-benh-nhan-C1a-BVQY175/G3_A4_SAMPLE_SIZE_hai-long-benh-nhan-C1a-BVQY175.docx
+++ b/exports/hai-long-benh-nhan-C1a-BVQY175/G3_A4_SAMPLE_SIZE_hai-long-benh-nhan-C1a-BVQY175.docx
@@ -4,2094 +4,526 @@
   <w:body>
     <w:p>
       <w:pPr>
-        <w:spacing w:before="0" w:after="320" w:lineRule="auto" w:line="312"/>
-        <w:jc w:val="center"/>
+        <w:pStyle w:val="Title"/>
       </w:pPr>
       <w:r>
         <w:rPr>
-          <w:rFonts w:ascii="Times New Roman" w:hAnsi="Times New Roman" w:eastAsia="Times New Roman" w:cs="Times New Roman"/>
-          <w:b/>
-          <w:i w:val="0"/>
-          <w:sz w:val="32"/>
+          <w:rFonts w:ascii="Times New Roman" w:hAnsi="Times New Roman" w:eastAsia="Times New Roman"/>
+          <w:sz w:val="26"/>
+        </w:rPr>
+        <w:t>A4 — KẾ HOẠCH CỠ MẪU</w:t>
+      </w:r>
+    </w:p>
+    <w:p>
+      <w:pPr>
+        <w:pStyle w:val="Heading1"/>
+      </w:pPr>
+      <w:r>
+        <w:rPr>
+          <w:rFonts w:ascii="Times New Roman" w:hAnsi="Times New Roman" w:eastAsia="Times New Roman"/>
+          <w:sz w:val="26"/>
         </w:rPr>
         <w:t>A4 — KẾ HOẠCH CỠ MẪU (DRAFT)</w:t>
       </w:r>
     </w:p>
     <w:p>
-      <w:pPr>
-        <w:spacing w:before="0" w:after="160" w:lineRule="auto" w:line="360"/>
-        <w:jc w:val="both"/>
-      </w:pPr>
       <w:r>
         <w:rPr>
-          <w:rFonts w:ascii="Times New Roman" w:hAnsi="Times New Roman" w:eastAsia="Times New Roman" w:cs="Times New Roman"/>
-          <w:b/>
-          <w:i w:val="0"/>
+          <w:rFonts w:ascii="Times New Roman" w:hAnsi="Times New Roman" w:eastAsia="Times New Roman"/>
           <w:sz w:val="26"/>
         </w:rPr>
-        <w:t>Đề tài:</w:t>
+        <w:t xml:space="preserve">**Đề tài:** Sự hài lòng của bệnh nhân trong hoạt động khám chữa bệnh tại Khoa Khám bệnh theo yêu cầu, bệnh viện quân y tuyến cuối  </w:t>
       </w:r>
+    </w:p>
+    <w:p>
       <w:r>
         <w:rPr>
-          <w:rFonts w:ascii="Times New Roman" w:hAnsi="Times New Roman" w:eastAsia="Times New Roman" w:cs="Times New Roman"/>
-          <w:b w:val="0"/>
-          <w:i w:val="0"/>
+          <w:rFonts w:ascii="Times New Roman" w:hAnsi="Times New Roman" w:eastAsia="Times New Roman"/>
           <w:sz w:val="26"/>
         </w:rPr>
-        <w:t xml:space="preserve"> Sự hài lòng của bệnh nhân trong hoạt động khám chữa bệnh tại Khoa Khám bệnh theo yêu cầu, bệnh viện quân y tuyến cuối</w:t>
+        <w:t>**Mã:** hai-long-benh-nhan-C1a-BVQY175 | **Ngày sinh:** 2026-10-07 | **Trạng thái:** DRAFT — CHỜ BÁC SĨ XÁC NHẬN</w:t>
+      </w:r>
+    </w:p>
+    <w:p>
+      <w:r>
+        <w:rPr>
+          <w:rFonts w:ascii="Times New Roman" w:hAnsi="Times New Roman" w:eastAsia="Times New Roman"/>
+          <w:sz w:val="26"/>
+        </w:rPr>
+        <w:t>---</w:t>
       </w:r>
     </w:p>
     <w:p>
       <w:pPr>
-        <w:spacing w:before="0" w:after="160" w:lineRule="auto" w:line="360"/>
-        <w:jc w:val="both"/>
+        <w:pStyle w:val="Heading2"/>
       </w:pPr>
       <w:r>
         <w:rPr>
-          <w:rFonts w:ascii="Times New Roman" w:hAnsi="Times New Roman" w:eastAsia="Times New Roman" w:cs="Times New Roman"/>
-          <w:b/>
-          <w:i w:val="0"/>
+          <w:rFonts w:ascii="Times New Roman" w:hAnsi="Times New Roman" w:eastAsia="Times New Roman"/>
           <w:sz w:val="26"/>
         </w:rPr>
-        <w:t>Mã:</w:t>
+        <w:t>PHẦN 1 — THÔNG SỐ ĐẦU VÀO</w:t>
       </w:r>
+    </w:p>
+    <w:p>
       <w:r>
         <w:rPr>
-          <w:rFonts w:ascii="Times New Roman" w:hAnsi="Times New Roman" w:eastAsia="Times New Roman" w:cs="Times New Roman"/>
-          <w:b w:val="0"/>
-          <w:i w:val="0"/>
+          <w:rFonts w:ascii="Times New Roman" w:hAnsi="Times New Roman" w:eastAsia="Times New Roman"/>
           <w:sz w:val="26"/>
         </w:rPr>
-        <w:t xml:space="preserve"> hai-long-benh-nhan-C1a-BVQY175 | </w:t>
+        <w:t>| Thông số | Giá trị | Nguồn |</w:t>
       </w:r>
+    </w:p>
+    <w:p>
       <w:r>
         <w:rPr>
-          <w:rFonts w:ascii="Times New Roman" w:hAnsi="Times New Roman" w:eastAsia="Times New Roman" w:cs="Times New Roman"/>
-          <w:b/>
-          <w:i w:val="0"/>
+          <w:rFonts w:ascii="Times New Roman" w:hAnsi="Times New Roman" w:eastAsia="Times New Roman"/>
           <w:sz w:val="26"/>
         </w:rPr>
-        <w:t>Ngày sinh:</w:t>
+        <w:t>|---|---|---|</w:t>
       </w:r>
+    </w:p>
+    <w:p>
       <w:r>
         <w:rPr>
-          <w:rFonts w:ascii="Times New Roman" w:hAnsi="Times New Roman" w:eastAsia="Times New Roman" w:cs="Times New Roman"/>
-          <w:b w:val="0"/>
-          <w:i w:val="0"/>
+          <w:rFonts w:ascii="Times New Roman" w:hAnsi="Times New Roman" w:eastAsia="Times New Roman"/>
           <w:sz w:val="26"/>
         </w:rPr>
-        <w:t xml:space="preserve"> 2026-07-31 | </w:t>
+        <w:t>| Khung cỡ mẫu | Ước lượng theo ĐỘ CHÍNH XÁC (không kiểm định giả thuyết) | ghim trong study_meta |</w:t>
       </w:r>
+    </w:p>
+    <w:p>
       <w:r>
         <w:rPr>
-          <w:rFonts w:ascii="Times New Roman" w:hAnsi="Times New Roman" w:eastAsia="Times New Roman" w:cs="Times New Roman"/>
-          <w:b/>
-          <w:i w:val="0"/>
+          <w:rFonts w:ascii="Times New Roman" w:hAnsi="Times New Roman" w:eastAsia="Times New Roman"/>
           <w:sz w:val="26"/>
         </w:rPr>
-        <w:t>Trạng thái:</w:t>
+        <w:t>| Độ tin cậy | 95% (α = 0.05, hai phía) | Quy ước |</w:t>
       </w:r>
+    </w:p>
+    <w:p>
       <w:r>
         <w:rPr>
-          <w:rFonts w:ascii="Times New Roman" w:hAnsi="Times New Roman" w:eastAsia="Times New Roman" w:cs="Times New Roman"/>
-          <w:b w:val="0"/>
-          <w:i w:val="0"/>
+          <w:rFonts w:ascii="Times New Roman" w:hAnsi="Times New Roman" w:eastAsia="Times New Roman"/>
+          <w:color w:val="CC4400"/>
           <w:sz w:val="26"/>
         </w:rPr>
-        <w:t xml:space="preserve"> DRAFT — CHỜ BÁC SĨ XÁC NHẬN</w:t>
+        <w:t>| Tỷ lệ không trả lời dự kiến | 15% | [CẦN BÁC SĨ XÁC NHẬN] |</w:t>
+      </w:r>
+    </w:p>
+    <w:p>
+      <w:r>
+        <w:rPr>
+          <w:rFonts w:ascii="Times New Roman" w:hAnsi="Times New Roman" w:eastAsia="Times New Roman"/>
+          <w:sz w:val="26"/>
+        </w:rPr>
+        <w:t>| Tỷ lệ ước lượng p | 0.50 | ghim trong study_meta; nguồn: Quy ước thận trọng p = 0,50 — giá trị làm phương sai p(1-p) lớn nhất nên cho cỡ mẫu lớn nhất; dùng khi chưa có ước lượng tỷ lệ hài lòng tại chính Khoa C1a. Nguồn công thức: Lwanga SK, Lemeshow S. Sample size determination in health studies: a practical manual. WHO, 1991 (mục 4.4.1 đề cương) |</w:t>
+      </w:r>
+    </w:p>
+    <w:p>
+      <w:r>
+        <w:rPr>
+          <w:rFonts w:ascii="Times New Roman" w:hAnsi="Times New Roman" w:eastAsia="Times New Roman"/>
+          <w:sz w:val="26"/>
+        </w:rPr>
+        <w:t>| Sai số tuyệt đối cho phép d | ±5% | ghim trong study_meta |</w:t>
+      </w:r>
+    </w:p>
+    <w:p>
+      <w:r>
+        <w:rPr>
+          <w:rFonts w:ascii="Times New Roman" w:hAnsi="Times New Roman" w:eastAsia="Times New Roman"/>
+          <w:sz w:val="26"/>
+        </w:rPr>
+        <w:t xml:space="preserve">&gt; **Thiết kế:** Nghiên cứu Cắt ngang Mô tả (Cross-sectional / Prevalence)  </w:t>
+      </w:r>
+    </w:p>
+    <w:p>
+      <w:r>
+        <w:rPr>
+          <w:rFonts w:ascii="Times New Roman" w:hAnsi="Times New Roman" w:eastAsia="Times New Roman"/>
+          <w:sz w:val="26"/>
+        </w:rPr>
+        <w:t>&gt; **Công thức:** Cỡ mẫu ước lượng một tỷ lệ theo độ chính xác (Lwanga &amp; Lemeshow/Cochran, xấp xỉ chuẩn): tỷ lệ hiện mắc ước lượng p=0.50, sai số cho phép d=0.05, alpha=0.05 Đã áp design effect cụm (DE=1+(m-1)×ICC=1.38, m=20, ICC=0.02): n 385 đến 532 (~27 cụm).</w:t>
+      </w:r>
+    </w:p>
+    <w:p>
+      <w:r>
+        <w:rPr>
+          <w:rFonts w:ascii="Times New Roman" w:hAnsi="Times New Roman" w:eastAsia="Times New Roman"/>
+          <w:sz w:val="26"/>
+        </w:rPr>
+        <w:t>---</w:t>
       </w:r>
     </w:p>
     <w:p>
       <w:pPr>
-        <w:spacing w:before="280" w:after="160" w:lineRule="auto" w:line="312"/>
+        <w:pStyle w:val="Heading2"/>
       </w:pPr>
       <w:r>
         <w:rPr>
-          <w:rFonts w:ascii="Times New Roman" w:hAnsi="Times New Roman" w:eastAsia="Times New Roman" w:cs="Times New Roman"/>
-          <w:b/>
-          <w:i w:val="0"/>
-          <w:sz w:val="28"/>
+          <w:rFonts w:ascii="Times New Roman" w:hAnsi="Times New Roman" w:eastAsia="Times New Roman"/>
+          <w:sz w:val="26"/>
         </w:rPr>
-        <w:t>PHẦN 1 — THÔNG SỐ ĐẦU VÀO</w:t>
+        <w:t>PHẦN 2 — KẾT QUẢ TÍNH TOÁN</w:t>
       </w:r>
     </w:p>
-    <w:tbl>
-      <w:tblPr>
-        <w:tblStyle w:val="TableGrid"/>
-        <w:tblW w:type="auto" w:w="0"/>
-        <w:jc w:val="center"/>
-        <w:tblLayout w:type="fixed"/>
-        <w:tblLook w:firstColumn="1" w:firstRow="1" w:lastColumn="0" w:lastRow="0" w:noHBand="0" w:noVBand="1" w:val="04A0"/>
-      </w:tblPr>
-      <w:tblGrid>
-        <w:gridCol w:w="3024"/>
-        <w:gridCol w:w="3024"/>
-        <w:gridCol w:w="3024"/>
-      </w:tblGrid>
-      <w:tr>
-        <w:trPr>
-          <w:tblHeader w:val="true"/>
-        </w:trPr>
-        <w:tc>
-          <w:tcPr>
-            <w:tcW w:type="dxa" w:w="3024"/>
-            <w:vAlign w:val="top"/>
-            <w:tcMar>
-              <w:top w:w="108" w:type="dxa"/>
-              <w:left w:w="108" w:type="dxa"/>
-              <w:bottom w:w="108" w:type="dxa"/>
-              <w:right w:w="108" w:type="dxa"/>
-            </w:tcMar>
-            <w:shd w:fill="D9EAF7"/>
-          </w:tcPr>
-          <w:p>
-            <w:pPr>
-              <w:spacing w:before="40" w:after="40" w:lineRule="auto" w:line="276"/>
-              <w:jc w:val="center"/>
-            </w:pPr>
-            <w:r/>
-            <w:r>
-              <w:rPr>
-                <w:rFonts w:ascii="Times New Roman" w:hAnsi="Times New Roman" w:eastAsia="Times New Roman" w:cs="Times New Roman"/>
-                <w:b/>
-                <w:i w:val="0"/>
-                <w:sz w:val="22"/>
-              </w:rPr>
-              <w:t>Thông số</w:t>
-            </w:r>
-          </w:p>
-        </w:tc>
-        <w:tc>
-          <w:tcPr>
-            <w:tcW w:type="dxa" w:w="3024"/>
-            <w:vAlign w:val="top"/>
-            <w:tcMar>
-              <w:top w:w="108" w:type="dxa"/>
-              <w:left w:w="108" w:type="dxa"/>
-              <w:bottom w:w="108" w:type="dxa"/>
-              <w:right w:w="108" w:type="dxa"/>
-            </w:tcMar>
-            <w:shd w:fill="D9EAF7"/>
-          </w:tcPr>
-          <w:p>
-            <w:pPr>
-              <w:spacing w:before="40" w:after="40" w:lineRule="auto" w:line="276"/>
-              <w:jc w:val="center"/>
-            </w:pPr>
-            <w:r/>
-            <w:r>
-              <w:rPr>
-                <w:rFonts w:ascii="Times New Roman" w:hAnsi="Times New Roman" w:eastAsia="Times New Roman" w:cs="Times New Roman"/>
-                <w:b/>
-                <w:i w:val="0"/>
-                <w:sz w:val="22"/>
-              </w:rPr>
-              <w:t>Giá trị</w:t>
-            </w:r>
-          </w:p>
-        </w:tc>
-        <w:tc>
-          <w:tcPr>
-            <w:tcW w:type="dxa" w:w="3024"/>
-            <w:vAlign w:val="top"/>
-            <w:tcMar>
-              <w:top w:w="108" w:type="dxa"/>
-              <w:left w:w="108" w:type="dxa"/>
-              <w:bottom w:w="108" w:type="dxa"/>
-              <w:right w:w="108" w:type="dxa"/>
-            </w:tcMar>
-            <w:shd w:fill="D9EAF7"/>
-          </w:tcPr>
-          <w:p>
-            <w:pPr>
-              <w:spacing w:before="40" w:after="40" w:lineRule="auto" w:line="276"/>
-              <w:jc w:val="center"/>
-            </w:pPr>
-            <w:r/>
-            <w:r>
-              <w:rPr>
-                <w:rFonts w:ascii="Times New Roman" w:hAnsi="Times New Roman" w:eastAsia="Times New Roman" w:cs="Times New Roman"/>
-                <w:b/>
-                <w:i w:val="0"/>
-                <w:sz w:val="22"/>
-              </w:rPr>
-              <w:t>Nguồn</w:t>
-            </w:r>
-          </w:p>
-        </w:tc>
-      </w:tr>
-      <w:tr>
-        <w:tc>
-          <w:tcPr>
-            <w:tcW w:type="dxa" w:w="3024"/>
-            <w:vAlign w:val="top"/>
-            <w:tcMar>
-              <w:top w:w="108" w:type="dxa"/>
-              <w:left w:w="108" w:type="dxa"/>
-              <w:bottom w:w="108" w:type="dxa"/>
-              <w:right w:w="108" w:type="dxa"/>
-            </w:tcMar>
-          </w:tcPr>
-          <w:p>
-            <w:pPr>
-              <w:spacing w:before="40" w:after="40" w:lineRule="auto" w:line="276"/>
-              <w:jc w:val="both"/>
-            </w:pPr>
-            <w:r/>
-            <w:r>
-              <w:rPr>
-                <w:rFonts w:ascii="Times New Roman" w:hAnsi="Times New Roman" w:eastAsia="Times New Roman" w:cs="Times New Roman"/>
-                <w:b w:val="0"/>
-                <w:i w:val="0"/>
-                <w:sz w:val="22"/>
-              </w:rPr>
-              <w:t>Loại giả thuyết</w:t>
-            </w:r>
-          </w:p>
-        </w:tc>
-        <w:tc>
-          <w:tcPr>
-            <w:tcW w:type="dxa" w:w="3024"/>
-            <w:vAlign w:val="top"/>
-            <w:tcMar>
-              <w:top w:w="108" w:type="dxa"/>
-              <w:left w:w="108" w:type="dxa"/>
-              <w:bottom w:w="108" w:type="dxa"/>
-              <w:right w:w="108" w:type="dxa"/>
-            </w:tcMar>
-          </w:tcPr>
-          <w:p>
-            <w:pPr>
-              <w:spacing w:before="40" w:after="40" w:lineRule="auto" w:line="276"/>
-              <w:jc w:val="both"/>
-            </w:pPr>
-            <w:r/>
-            <w:r>
-              <w:rPr>
-                <w:rFonts w:ascii="Times New Roman" w:hAnsi="Times New Roman" w:eastAsia="Times New Roman" w:cs="Times New Roman"/>
-                <w:b w:val="0"/>
-                <w:i w:val="0"/>
-                <w:sz w:val="22"/>
-              </w:rPr>
-              <w:t>superiority</w:t>
-            </w:r>
-          </w:p>
-        </w:tc>
-        <w:tc>
-          <w:tcPr>
-            <w:tcW w:type="dxa" w:w="3024"/>
-            <w:vAlign w:val="top"/>
-            <w:tcMar>
-              <w:top w:w="108" w:type="dxa"/>
-              <w:left w:w="108" w:type="dxa"/>
-              <w:bottom w:w="108" w:type="dxa"/>
-              <w:right w:w="108" w:type="dxa"/>
-            </w:tcMar>
-          </w:tcPr>
-          <w:p>
-            <w:pPr>
-              <w:spacing w:before="40" w:after="40" w:lineRule="auto" w:line="276"/>
-              <w:jc w:val="both"/>
-            </w:pPr>
-            <w:r/>
-            <w:r>
-              <w:rPr>
-                <w:rFonts w:ascii="Times New Roman" w:hAnsi="Times New Roman" w:eastAsia="Times New Roman" w:cs="Times New Roman"/>
-                <w:b w:val="0"/>
-                <w:i w:val="0"/>
-                <w:sz w:val="22"/>
-              </w:rPr>
-              <w:t>Quy ước (mặc định)</w:t>
-            </w:r>
-          </w:p>
-        </w:tc>
-      </w:tr>
-      <w:tr>
-        <w:tc>
-          <w:tcPr>
-            <w:tcW w:type="dxa" w:w="3024"/>
-            <w:vAlign w:val="top"/>
-            <w:tcMar>
-              <w:top w:w="108" w:type="dxa"/>
-              <w:left w:w="108" w:type="dxa"/>
-              <w:bottom w:w="108" w:type="dxa"/>
-              <w:right w:w="108" w:type="dxa"/>
-            </w:tcMar>
-          </w:tcPr>
-          <w:p>
-            <w:pPr>
-              <w:spacing w:before="40" w:after="40" w:lineRule="auto" w:line="276"/>
-              <w:jc w:val="both"/>
-            </w:pPr>
-            <w:r/>
-            <w:r>
-              <w:rPr>
-                <w:rFonts w:ascii="Times New Roman" w:hAnsi="Times New Roman" w:eastAsia="Times New Roman" w:cs="Times New Roman"/>
-                <w:b w:val="0"/>
-                <w:i w:val="0"/>
-                <w:sz w:val="22"/>
-              </w:rPr>
-              <w:t>Mức ý nghĩa (α)</w:t>
-            </w:r>
-          </w:p>
-        </w:tc>
-        <w:tc>
-          <w:tcPr>
-            <w:tcW w:type="dxa" w:w="3024"/>
-            <w:vAlign w:val="top"/>
-            <w:tcMar>
-              <w:top w:w="108" w:type="dxa"/>
-              <w:left w:w="108" w:type="dxa"/>
-              <w:bottom w:w="108" w:type="dxa"/>
-              <w:right w:w="108" w:type="dxa"/>
-            </w:tcMar>
-          </w:tcPr>
-          <w:p>
-            <w:pPr>
-              <w:spacing w:before="40" w:after="40" w:lineRule="auto" w:line="276"/>
-              <w:jc w:val="both"/>
-            </w:pPr>
-            <w:r/>
-            <w:r>
-              <w:rPr>
-                <w:rFonts w:ascii="Times New Roman" w:hAnsi="Times New Roman" w:eastAsia="Times New Roman" w:cs="Times New Roman"/>
-                <w:b w:val="0"/>
-                <w:i w:val="0"/>
-                <w:sz w:val="22"/>
-              </w:rPr>
-              <w:t>0.05 (two-sided)</w:t>
-            </w:r>
-          </w:p>
-        </w:tc>
-        <w:tc>
-          <w:tcPr>
-            <w:tcW w:type="dxa" w:w="3024"/>
-            <w:vAlign w:val="top"/>
-            <w:tcMar>
-              <w:top w:w="108" w:type="dxa"/>
-              <w:left w:w="108" w:type="dxa"/>
-              <w:bottom w:w="108" w:type="dxa"/>
-              <w:right w:w="108" w:type="dxa"/>
-            </w:tcMar>
-          </w:tcPr>
-          <w:p>
-            <w:pPr>
-              <w:spacing w:before="40" w:after="40" w:lineRule="auto" w:line="276"/>
-              <w:jc w:val="both"/>
-            </w:pPr>
-            <w:r/>
-            <w:r>
-              <w:rPr>
-                <w:rFonts w:ascii="Times New Roman" w:hAnsi="Times New Roman" w:eastAsia="Times New Roman" w:cs="Times New Roman"/>
-                <w:b w:val="0"/>
-                <w:i w:val="0"/>
-                <w:sz w:val="22"/>
-              </w:rPr>
-              <w:t>Quy ước</w:t>
-            </w:r>
-          </w:p>
-        </w:tc>
-      </w:tr>
-      <w:tr>
-        <w:tc>
-          <w:tcPr>
-            <w:tcW w:type="dxa" w:w="3024"/>
-            <w:vAlign w:val="top"/>
-            <w:tcMar>
-              <w:top w:w="108" w:type="dxa"/>
-              <w:left w:w="108" w:type="dxa"/>
-              <w:bottom w:w="108" w:type="dxa"/>
-              <w:right w:w="108" w:type="dxa"/>
-            </w:tcMar>
-          </w:tcPr>
-          <w:p>
-            <w:pPr>
-              <w:spacing w:before="40" w:after="40" w:lineRule="auto" w:line="276"/>
-              <w:jc w:val="both"/>
-            </w:pPr>
-            <w:r/>
-            <w:r>
-              <w:rPr>
-                <w:rFonts w:ascii="Times New Roman" w:hAnsi="Times New Roman" w:eastAsia="Times New Roman" w:cs="Times New Roman"/>
-                <w:b w:val="0"/>
-                <w:i w:val="0"/>
-                <w:sz w:val="22"/>
-              </w:rPr>
-              <w:t>Lực thống kê (1−β)</w:t>
-            </w:r>
-          </w:p>
-        </w:tc>
-        <w:tc>
-          <w:tcPr>
-            <w:tcW w:type="dxa" w:w="3024"/>
-            <w:vAlign w:val="top"/>
-            <w:tcMar>
-              <w:top w:w="108" w:type="dxa"/>
-              <w:left w:w="108" w:type="dxa"/>
-              <w:bottom w:w="108" w:type="dxa"/>
-              <w:right w:w="108" w:type="dxa"/>
-            </w:tcMar>
-          </w:tcPr>
-          <w:p>
-            <w:pPr>
-              <w:spacing w:before="40" w:after="40" w:lineRule="auto" w:line="276"/>
-              <w:jc w:val="both"/>
-            </w:pPr>
-            <w:r/>
-            <w:r>
-              <w:rPr>
-                <w:rFonts w:ascii="Times New Roman" w:hAnsi="Times New Roman" w:eastAsia="Times New Roman" w:cs="Times New Roman"/>
-                <w:b w:val="0"/>
-                <w:i w:val="0"/>
-                <w:sz w:val="22"/>
-              </w:rPr>
-              <w:t>80%</w:t>
-            </w:r>
-          </w:p>
-        </w:tc>
-        <w:tc>
-          <w:tcPr>
-            <w:tcW w:type="dxa" w:w="3024"/>
-            <w:vAlign w:val="top"/>
-            <w:tcMar>
-              <w:top w:w="108" w:type="dxa"/>
-              <w:left w:w="108" w:type="dxa"/>
-              <w:bottom w:w="108" w:type="dxa"/>
-              <w:right w:w="108" w:type="dxa"/>
-            </w:tcMar>
-          </w:tcPr>
-          <w:p>
-            <w:pPr>
-              <w:spacing w:before="40" w:after="40" w:lineRule="auto" w:line="276"/>
-              <w:jc w:val="both"/>
-            </w:pPr>
-            <w:r/>
-            <w:r>
-              <w:rPr>
-                <w:rFonts w:ascii="Times New Roman" w:hAnsi="Times New Roman" w:eastAsia="Times New Roman" w:cs="Times New Roman"/>
-                <w:b w:val="0"/>
-                <w:i w:val="0"/>
-                <w:sz w:val="22"/>
-              </w:rPr>
-              <w:t>Quy ước</w:t>
-            </w:r>
-          </w:p>
-        </w:tc>
-      </w:tr>
-      <w:tr>
-        <w:tc>
-          <w:tcPr>
-            <w:tcW w:type="dxa" w:w="3024"/>
-            <w:vAlign w:val="top"/>
-            <w:tcMar>
-              <w:top w:w="108" w:type="dxa"/>
-              <w:left w:w="108" w:type="dxa"/>
-              <w:bottom w:w="108" w:type="dxa"/>
-              <w:right w:w="108" w:type="dxa"/>
-            </w:tcMar>
-          </w:tcPr>
-          <w:p>
-            <w:pPr>
-              <w:spacing w:before="40" w:after="40" w:lineRule="auto" w:line="276"/>
-              <w:jc w:val="both"/>
-            </w:pPr>
-            <w:r/>
-            <w:r>
-              <w:rPr>
-                <w:rFonts w:ascii="Times New Roman" w:hAnsi="Times New Roman" w:eastAsia="Times New Roman" w:cs="Times New Roman"/>
-                <w:b w:val="0"/>
-                <w:i w:val="0"/>
-                <w:sz w:val="22"/>
-              </w:rPr>
-              <w:t>Tỷ lệ bỏ cuộc dự kiến</w:t>
-            </w:r>
-          </w:p>
-        </w:tc>
-        <w:tc>
-          <w:tcPr>
-            <w:tcW w:type="dxa" w:w="3024"/>
-            <w:vAlign w:val="top"/>
-            <w:tcMar>
-              <w:top w:w="108" w:type="dxa"/>
-              <w:left w:w="108" w:type="dxa"/>
-              <w:bottom w:w="108" w:type="dxa"/>
-              <w:right w:w="108" w:type="dxa"/>
-            </w:tcMar>
-          </w:tcPr>
-          <w:p>
-            <w:pPr>
-              <w:spacing w:before="40" w:after="40" w:lineRule="auto" w:line="276"/>
-              <w:jc w:val="both"/>
-            </w:pPr>
-            <w:r/>
-            <w:r>
-              <w:rPr>
-                <w:rFonts w:ascii="Times New Roman" w:hAnsi="Times New Roman" w:eastAsia="Times New Roman" w:cs="Times New Roman"/>
-                <w:b w:val="0"/>
-                <w:i w:val="0"/>
-                <w:sz w:val="22"/>
-              </w:rPr>
-              <w:t>15%</w:t>
-            </w:r>
-          </w:p>
-        </w:tc>
-        <w:tc>
-          <w:tcPr>
-            <w:tcW w:type="dxa" w:w="3024"/>
-            <w:vAlign w:val="top"/>
-            <w:tcMar>
-              <w:top w:w="108" w:type="dxa"/>
-              <w:left w:w="108" w:type="dxa"/>
-              <w:bottom w:w="108" w:type="dxa"/>
-              <w:right w:w="108" w:type="dxa"/>
-            </w:tcMar>
-          </w:tcPr>
-          <w:p>
-            <w:pPr>
-              <w:spacing w:before="40" w:after="40" w:lineRule="auto" w:line="276"/>
-              <w:jc w:val="both"/>
-            </w:pPr>
-            <w:r/>
-            <w:r>
-              <w:rPr>
-                <w:rFonts w:ascii="Times New Roman" w:hAnsi="Times New Roman" w:eastAsia="Times New Roman" w:cs="Times New Roman"/>
-                <w:b/>
-                <w:i/>
-                <w:color w:val="CC7700"/>
-                <w:sz w:val="22"/>
-              </w:rPr>
-              <w:t>[CẦN BÁC SĨ XÁC NHẬN]</w:t>
-            </w:r>
-          </w:p>
-        </w:tc>
-      </w:tr>
-      <w:tr>
-        <w:tc>
-          <w:tcPr>
-            <w:tcW w:type="dxa" w:w="3024"/>
-            <w:vAlign w:val="top"/>
-            <w:tcMar>
-              <w:top w:w="108" w:type="dxa"/>
-              <w:left w:w="108" w:type="dxa"/>
-              <w:bottom w:w="108" w:type="dxa"/>
-              <w:right w:w="108" w:type="dxa"/>
-            </w:tcMar>
-          </w:tcPr>
-          <w:p>
-            <w:pPr>
-              <w:spacing w:before="40" w:after="40" w:lineRule="auto" w:line="276"/>
-              <w:jc w:val="both"/>
-            </w:pPr>
-            <w:r/>
-            <w:r>
-              <w:rPr>
-                <w:rFonts w:ascii="Times New Roman" w:hAnsi="Times New Roman" w:eastAsia="Times New Roman" w:cs="Times New Roman"/>
-                <w:b w:val="0"/>
-                <w:i w:val="0"/>
-                <w:sz w:val="22"/>
-              </w:rPr>
-              <w:t>Effect size ước lượng</w:t>
-            </w:r>
-          </w:p>
-        </w:tc>
-        <w:tc>
-          <w:tcPr>
-            <w:tcW w:type="dxa" w:w="3024"/>
-            <w:vAlign w:val="top"/>
-            <w:tcMar>
-              <w:top w:w="108" w:type="dxa"/>
-              <w:left w:w="108" w:type="dxa"/>
-              <w:bottom w:w="108" w:type="dxa"/>
-              <w:right w:w="108" w:type="dxa"/>
-            </w:tcMar>
-          </w:tcPr>
-          <w:p>
-            <w:pPr>
-              <w:spacing w:before="40" w:after="40" w:lineRule="auto" w:line="276"/>
-              <w:jc w:val="both"/>
-            </w:pPr>
-            <w:r/>
-            <w:r>
-              <w:rPr>
-                <w:rFonts w:ascii="Times New Roman" w:hAnsi="Times New Roman" w:eastAsia="Times New Roman" w:cs="Times New Roman"/>
-                <w:b w:val="0"/>
-                <w:i w:val="0"/>
-                <w:sz w:val="22"/>
-              </w:rPr>
-              <w:t>PREVALENCE = 0.50</w:t>
-            </w:r>
-          </w:p>
-        </w:tc>
-        <w:tc>
-          <w:tcPr>
-            <w:tcW w:type="dxa" w:w="3024"/>
-            <w:vAlign w:val="top"/>
-            <w:tcMar>
-              <w:top w:w="108" w:type="dxa"/>
-              <w:left w:w="108" w:type="dxa"/>
-              <w:bottom w:w="108" w:type="dxa"/>
-              <w:right w:w="108" w:type="dxa"/>
-            </w:tcMar>
-          </w:tcPr>
-          <w:p>
-            <w:pPr>
-              <w:spacing w:before="40" w:after="40" w:lineRule="auto" w:line="276"/>
-              <w:jc w:val="both"/>
-            </w:pPr>
-            <w:r/>
-            <w:r>
-              <w:rPr>
-                <w:rFonts w:ascii="Times New Roman" w:hAnsi="Times New Roman" w:eastAsia="Times New Roman" w:cs="Times New Roman"/>
-                <w:b w:val="0"/>
-                <w:i w:val="0"/>
-                <w:sz w:val="22"/>
-              </w:rPr>
-              <w:t>Trích từ y văn G0</w:t>
-            </w:r>
-          </w:p>
-        </w:tc>
-      </w:tr>
-      <w:tr>
-        <w:tc>
-          <w:tcPr>
-            <w:tcW w:type="dxa" w:w="3024"/>
-            <w:vAlign w:val="top"/>
-            <w:tcMar>
-              <w:top w:w="108" w:type="dxa"/>
-              <w:left w:w="108" w:type="dxa"/>
-              <w:bottom w:w="108" w:type="dxa"/>
-              <w:right w:w="108" w:type="dxa"/>
-            </w:tcMar>
-          </w:tcPr>
-          <w:p>
-            <w:pPr>
-              <w:spacing w:before="40" w:after="40" w:lineRule="auto" w:line="276"/>
-              <w:jc w:val="both"/>
-            </w:pPr>
-            <w:r/>
-            <w:r>
-              <w:rPr>
-                <w:rFonts w:ascii="Times New Roman" w:hAnsi="Times New Roman" w:eastAsia="Times New Roman" w:cs="Times New Roman"/>
-                <w:b w:val="0"/>
-                <w:i w:val="0"/>
-                <w:sz w:val="22"/>
-              </w:rPr>
-              <w:t>Loại hiệu quả</w:t>
-            </w:r>
-          </w:p>
-        </w:tc>
-        <w:tc>
-          <w:tcPr>
-            <w:tcW w:type="dxa" w:w="3024"/>
-            <w:vAlign w:val="top"/>
-            <w:tcMar>
-              <w:top w:w="108" w:type="dxa"/>
-              <w:left w:w="108" w:type="dxa"/>
-              <w:bottom w:w="108" w:type="dxa"/>
-              <w:right w:w="108" w:type="dxa"/>
-            </w:tcMar>
-          </w:tcPr>
-          <w:p>
-            <w:pPr>
-              <w:spacing w:before="40" w:after="40" w:lineRule="auto" w:line="276"/>
-              <w:jc w:val="both"/>
-            </w:pPr>
-            <w:r/>
-            <w:r>
-              <w:rPr>
-                <w:rFonts w:ascii="Times New Roman" w:hAnsi="Times New Roman" w:eastAsia="Times New Roman" w:cs="Times New Roman"/>
-                <w:b w:val="0"/>
-                <w:i w:val="0"/>
-                <w:sz w:val="22"/>
-              </w:rPr>
-              <w:t>PREVALENCE</w:t>
-            </w:r>
-          </w:p>
-        </w:tc>
-        <w:tc>
-          <w:tcPr>
-            <w:tcW w:type="dxa" w:w="3024"/>
-            <w:vAlign w:val="top"/>
-            <w:tcMar>
-              <w:top w:w="108" w:type="dxa"/>
-              <w:left w:w="108" w:type="dxa"/>
-              <w:bottom w:w="108" w:type="dxa"/>
-              <w:right w:w="108" w:type="dxa"/>
-            </w:tcMar>
-          </w:tcPr>
-          <w:p>
-            <w:pPr>
-              <w:spacing w:before="40" w:after="40" w:lineRule="auto" w:line="276"/>
-              <w:jc w:val="both"/>
-            </w:pPr>
-            <w:r/>
-            <w:r>
-              <w:rPr>
-                <w:rFonts w:ascii="Times New Roman" w:hAnsi="Times New Roman" w:eastAsia="Times New Roman" w:cs="Times New Roman"/>
-                <w:b w:val="0"/>
-                <w:i w:val="0"/>
-                <w:sz w:val="22"/>
-              </w:rPr>
-              <w:t>G1 checkpoint</w:t>
-            </w:r>
-          </w:p>
-        </w:tc>
-      </w:tr>
-    </w:tbl>
-    <w:p/>
     <w:p>
-      <w:pPr>
-        <w:spacing w:before="120" w:after="200" w:lineRule="auto" w:line="312"/>
-        <w:jc w:val="both"/>
-        <w:ind w:left="567" w:right="567"/>
-      </w:pPr>
       <w:r>
         <w:rPr>
-          <w:rFonts w:ascii="Times New Roman" w:hAnsi="Times New Roman" w:eastAsia="Times New Roman" w:cs="Times New Roman"/>
-          <w:b/>
-          <w:i/>
-          <w:sz w:val="22"/>
+          <w:rFonts w:ascii="Times New Roman" w:hAnsi="Times New Roman" w:eastAsia="Times New Roman"/>
+          <w:sz w:val="26"/>
         </w:rPr>
-        <w:t>Thiết kế:</w:t>
+        <w:t>| Chỉ số | Kết quả |</w:t>
       </w:r>
+    </w:p>
+    <w:p>
       <w:r>
         <w:rPr>
-          <w:rFonts w:ascii="Times New Roman" w:hAnsi="Times New Roman" w:eastAsia="Times New Roman" w:cs="Times New Roman"/>
-          <w:b w:val="0"/>
-          <w:i/>
-          <w:sz w:val="22"/>
+          <w:rFonts w:ascii="Times New Roman" w:hAnsi="Times New Roman" w:eastAsia="Times New Roman"/>
+          <w:sz w:val="26"/>
         </w:rPr>
-        <w:t xml:space="preserve"> Nghiên cứu Cắt ngang Mô tả (Cross-sectional / Prevalence)</w:t>
+        <w:t>|---|---|</w:t>
+      </w:r>
+    </w:p>
+    <w:p>
+      <w:r>
+        <w:rPr>
+          <w:rFonts w:ascii="Times New Roman" w:hAnsi="Times New Roman" w:eastAsia="Times New Roman"/>
+          <w:sz w:val="26"/>
+        </w:rPr>
+        <w:t>| N cần (chưa bù không trả lời) | **532** |</w:t>
+      </w:r>
+    </w:p>
+    <w:p>
+      <w:r>
+        <w:rPr>
+          <w:rFonts w:ascii="Times New Roman" w:hAnsi="Times New Roman" w:eastAsia="Times New Roman"/>
+          <w:sz w:val="26"/>
+        </w:rPr>
+        <w:t>| N điều chỉnh (15%) | **626** |</w:t>
+      </w:r>
+    </w:p>
+    <w:p>
+      <w:r>
+        <w:rPr>
+          <w:rFonts w:ascii="Times New Roman" w:hAnsi="Times New Roman" w:eastAsia="Times New Roman"/>
+          <w:sz w:val="26"/>
+        </w:rPr>
+        <w:t>**KẾT LUẬN:** Nghiên cứu cần tuyển **626 người tham gia**.</w:t>
       </w:r>
     </w:p>
     <w:p>
       <w:pPr>
-        <w:spacing w:before="120" w:after="200" w:lineRule="auto" w:line="312"/>
-        <w:jc w:val="both"/>
-        <w:ind w:left="567" w:right="567"/>
+        <w:pStyle w:val="Heading2"/>
       </w:pPr>
       <w:r>
         <w:rPr>
-          <w:rFonts w:ascii="Times New Roman" w:hAnsi="Times New Roman" w:eastAsia="Times New Roman" w:cs="Times New Roman"/>
-          <w:b/>
-          <w:i/>
-          <w:sz w:val="22"/>
-        </w:rPr>
-        <w:t>Công thức:</w:t>
-      </w:r>
-      <w:r>
-        <w:rPr>
-          <w:rFonts w:ascii="Times New Roman" w:hAnsi="Times New Roman" w:eastAsia="Times New Roman" w:cs="Times New Roman"/>
-          <w:b w:val="0"/>
-          <w:i/>
-          <w:sz w:val="22"/>
-        </w:rPr>
-        <w:t xml:space="preserve"> Cỡ mẫu ước lượng một tỷ lệ theo độ chính xác (Lwanga &amp; Lemeshow/Cochran, xấp xỉ chuẩn): tỷ lệ hiện mắc ước lượng p=0.50, sai số cho phép d=0.05, alpha=0.05</w:t>
-      </w:r>
-    </w:p>
-    <w:p>
-      <w:pPr>
-        <w:spacing w:before="280" w:after="160" w:lineRule="auto" w:line="312"/>
-      </w:pPr>
-      <w:r>
-        <w:rPr>
-          <w:rFonts w:ascii="Times New Roman" w:hAnsi="Times New Roman" w:eastAsia="Times New Roman" w:cs="Times New Roman"/>
-          <w:b/>
-          <w:i w:val="0"/>
-          <w:sz w:val="28"/>
-        </w:rPr>
-        <w:t>PHẦN 2 — KẾT QUẢ TÍNH TOÁN</w:t>
-      </w:r>
-    </w:p>
-    <w:tbl>
-      <w:tblPr>
-        <w:tblStyle w:val="TableGrid"/>
-        <w:tblW w:type="auto" w:w="0"/>
-        <w:jc w:val="center"/>
-        <w:tblLayout w:type="fixed"/>
-        <w:tblLook w:firstColumn="1" w:firstRow="1" w:lastColumn="0" w:lastRow="0" w:noHBand="0" w:noVBand="1" w:val="04A0"/>
-      </w:tblPr>
-      <w:tblGrid>
-        <w:gridCol w:w="4535"/>
-        <w:gridCol w:w="4535"/>
-      </w:tblGrid>
-      <w:tr>
-        <w:trPr>
-          <w:tblHeader w:val="true"/>
-        </w:trPr>
-        <w:tc>
-          <w:tcPr>
-            <w:tcW w:type="dxa" w:w="4536"/>
-            <w:vAlign w:val="top"/>
-            <w:tcMar>
-              <w:top w:w="108" w:type="dxa"/>
-              <w:left w:w="108" w:type="dxa"/>
-              <w:bottom w:w="108" w:type="dxa"/>
-              <w:right w:w="108" w:type="dxa"/>
-            </w:tcMar>
-            <w:shd w:fill="D9EAF7"/>
-          </w:tcPr>
-          <w:p>
-            <w:pPr>
-              <w:spacing w:before="40" w:after="40" w:lineRule="auto" w:line="276"/>
-              <w:jc w:val="center"/>
-            </w:pPr>
-            <w:r/>
-            <w:r>
-              <w:rPr>
-                <w:rFonts w:ascii="Times New Roman" w:hAnsi="Times New Roman" w:eastAsia="Times New Roman" w:cs="Times New Roman"/>
-                <w:b/>
-                <w:i w:val="0"/>
-                <w:sz w:val="22"/>
-              </w:rPr>
-              <w:t>Chỉ số</w:t>
-            </w:r>
-          </w:p>
-        </w:tc>
-        <w:tc>
-          <w:tcPr>
-            <w:tcW w:type="dxa" w:w="4536"/>
-            <w:vAlign w:val="top"/>
-            <w:tcMar>
-              <w:top w:w="108" w:type="dxa"/>
-              <w:left w:w="108" w:type="dxa"/>
-              <w:bottom w:w="108" w:type="dxa"/>
-              <w:right w:w="108" w:type="dxa"/>
-            </w:tcMar>
-            <w:shd w:fill="D9EAF7"/>
-          </w:tcPr>
-          <w:p>
-            <w:pPr>
-              <w:spacing w:before="40" w:after="40" w:lineRule="auto" w:line="276"/>
-              <w:jc w:val="center"/>
-            </w:pPr>
-            <w:r/>
-            <w:r>
-              <w:rPr>
-                <w:rFonts w:ascii="Times New Roman" w:hAnsi="Times New Roman" w:eastAsia="Times New Roman" w:cs="Times New Roman"/>
-                <w:b/>
-                <w:i w:val="0"/>
-                <w:sz w:val="22"/>
-              </w:rPr>
-              <w:t>Kết quả</w:t>
-            </w:r>
-          </w:p>
-        </w:tc>
-      </w:tr>
-      <w:tr>
-        <w:tc>
-          <w:tcPr>
-            <w:tcW w:type="dxa" w:w="4536"/>
-            <w:vAlign w:val="top"/>
-            <w:tcMar>
-              <w:top w:w="108" w:type="dxa"/>
-              <w:left w:w="108" w:type="dxa"/>
-              <w:bottom w:w="108" w:type="dxa"/>
-              <w:right w:w="108" w:type="dxa"/>
-            </w:tcMar>
-          </w:tcPr>
-          <w:p>
-            <w:pPr>
-              <w:spacing w:before="40" w:after="40" w:lineRule="auto" w:line="276"/>
-              <w:jc w:val="both"/>
-            </w:pPr>
-            <w:r/>
-            <w:r>
-              <w:rPr>
-                <w:rFonts w:ascii="Times New Roman" w:hAnsi="Times New Roman" w:eastAsia="Times New Roman" w:cs="Times New Roman"/>
-                <w:b w:val="0"/>
-                <w:i w:val="0"/>
-                <w:sz w:val="22"/>
-              </w:rPr>
-              <w:t>N mỗi nhóm</w:t>
-            </w:r>
-          </w:p>
-        </w:tc>
-        <w:tc>
-          <w:tcPr>
-            <w:tcW w:type="dxa" w:w="4536"/>
-            <w:vAlign w:val="top"/>
-            <w:tcMar>
-              <w:top w:w="108" w:type="dxa"/>
-              <w:left w:w="108" w:type="dxa"/>
-              <w:bottom w:w="108" w:type="dxa"/>
-              <w:right w:w="108" w:type="dxa"/>
-            </w:tcMar>
-          </w:tcPr>
-          <w:p>
-            <w:pPr>
-              <w:spacing w:before="40" w:after="40" w:lineRule="auto" w:line="276"/>
-              <w:jc w:val="both"/>
-            </w:pPr>
-            <w:r/>
-            <w:r>
-              <w:rPr>
-                <w:rFonts w:ascii="Times New Roman" w:hAnsi="Times New Roman" w:eastAsia="Times New Roman" w:cs="Times New Roman"/>
-                <w:b/>
-                <w:i w:val="0"/>
-                <w:sz w:val="22"/>
-              </w:rPr>
-              <w:t>385</w:t>
-            </w:r>
-          </w:p>
-        </w:tc>
-      </w:tr>
-      <w:tr>
-        <w:tc>
-          <w:tcPr>
-            <w:tcW w:type="dxa" w:w="4536"/>
-            <w:vAlign w:val="top"/>
-            <w:tcMar>
-              <w:top w:w="108" w:type="dxa"/>
-              <w:left w:w="108" w:type="dxa"/>
-              <w:bottom w:w="108" w:type="dxa"/>
-              <w:right w:w="108" w:type="dxa"/>
-            </w:tcMar>
-          </w:tcPr>
-          <w:p>
-            <w:pPr>
-              <w:spacing w:before="40" w:after="40" w:lineRule="auto" w:line="276"/>
-              <w:jc w:val="both"/>
-            </w:pPr>
-            <w:r/>
-            <w:r>
-              <w:rPr>
-                <w:rFonts w:ascii="Times New Roman" w:hAnsi="Times New Roman" w:eastAsia="Times New Roman" w:cs="Times New Roman"/>
-                <w:b w:val="0"/>
-                <w:i w:val="0"/>
-                <w:sz w:val="22"/>
-              </w:rPr>
-              <w:t>N tổng (không dropout)</w:t>
-            </w:r>
-          </w:p>
-        </w:tc>
-        <w:tc>
-          <w:tcPr>
-            <w:tcW w:type="dxa" w:w="4536"/>
-            <w:vAlign w:val="top"/>
-            <w:tcMar>
-              <w:top w:w="108" w:type="dxa"/>
-              <w:left w:w="108" w:type="dxa"/>
-              <w:bottom w:w="108" w:type="dxa"/>
-              <w:right w:w="108" w:type="dxa"/>
-            </w:tcMar>
-          </w:tcPr>
-          <w:p>
-            <w:pPr>
-              <w:spacing w:before="40" w:after="40" w:lineRule="auto" w:line="276"/>
-              <w:jc w:val="both"/>
-            </w:pPr>
-            <w:r/>
-            <w:r>
-              <w:rPr>
-                <w:rFonts w:ascii="Times New Roman" w:hAnsi="Times New Roman" w:eastAsia="Times New Roman" w:cs="Times New Roman"/>
-                <w:b/>
-                <w:i w:val="0"/>
-                <w:sz w:val="22"/>
-              </w:rPr>
-              <w:t>385</w:t>
-            </w:r>
-          </w:p>
-        </w:tc>
-      </w:tr>
-      <w:tr>
-        <w:tc>
-          <w:tcPr>
-            <w:tcW w:type="dxa" w:w="4536"/>
-            <w:vAlign w:val="top"/>
-            <w:tcMar>
-              <w:top w:w="108" w:type="dxa"/>
-              <w:left w:w="108" w:type="dxa"/>
-              <w:bottom w:w="108" w:type="dxa"/>
-              <w:right w:w="108" w:type="dxa"/>
-            </w:tcMar>
-          </w:tcPr>
-          <w:p>
-            <w:pPr>
-              <w:spacing w:before="40" w:after="40" w:lineRule="auto" w:line="276"/>
-              <w:jc w:val="both"/>
-            </w:pPr>
-            <w:r/>
-            <w:r>
-              <w:rPr>
-                <w:rFonts w:ascii="Times New Roman" w:hAnsi="Times New Roman" w:eastAsia="Times New Roman" w:cs="Times New Roman"/>
-                <w:b w:val="0"/>
-                <w:i w:val="0"/>
-                <w:sz w:val="22"/>
-              </w:rPr>
-              <w:t>N điều chỉnh (dropout 15%)</w:t>
-            </w:r>
-          </w:p>
-        </w:tc>
-        <w:tc>
-          <w:tcPr>
-            <w:tcW w:type="dxa" w:w="4536"/>
-            <w:vAlign w:val="top"/>
-            <w:tcMar>
-              <w:top w:w="108" w:type="dxa"/>
-              <w:left w:w="108" w:type="dxa"/>
-              <w:bottom w:w="108" w:type="dxa"/>
-              <w:right w:w="108" w:type="dxa"/>
-            </w:tcMar>
-          </w:tcPr>
-          <w:p>
-            <w:pPr>
-              <w:spacing w:before="40" w:after="40" w:lineRule="auto" w:line="276"/>
-              <w:jc w:val="both"/>
-            </w:pPr>
-            <w:r/>
-            <w:r>
-              <w:rPr>
-                <w:rFonts w:ascii="Times New Roman" w:hAnsi="Times New Roman" w:eastAsia="Times New Roman" w:cs="Times New Roman"/>
-                <w:b/>
-                <w:i w:val="0"/>
-                <w:sz w:val="22"/>
-              </w:rPr>
-              <w:t>453</w:t>
-            </w:r>
-          </w:p>
-        </w:tc>
-      </w:tr>
-    </w:tbl>
-    <w:p/>
-    <w:p>
-      <w:pPr>
-        <w:spacing w:before="0" w:after="160" w:lineRule="auto" w:line="360"/>
-        <w:jc w:val="both"/>
-      </w:pPr>
-      <w:r>
-        <w:rPr>
-          <w:rFonts w:ascii="Times New Roman" w:hAnsi="Times New Roman" w:eastAsia="Times New Roman" w:cs="Times New Roman"/>
-          <w:b/>
-          <w:i w:val="0"/>
+          <w:rFonts w:ascii="Times New Roman" w:hAnsi="Times New Roman" w:eastAsia="Times New Roman"/>
           <w:sz w:val="26"/>
-        </w:rPr>
-        <w:t>KẾT LUẬN:</w:t>
-      </w:r>
-      <w:r>
-        <w:rPr>
-          <w:rFonts w:ascii="Times New Roman" w:hAnsi="Times New Roman" w:eastAsia="Times New Roman" w:cs="Times New Roman"/>
-          <w:b w:val="0"/>
-          <w:i w:val="0"/>
-          <w:sz w:val="26"/>
-        </w:rPr>
-        <w:t xml:space="preserve"> Nghiên cứu cần tuyển </w:t>
-      </w:r>
-      <w:r>
-        <w:rPr>
-          <w:rFonts w:ascii="Times New Roman" w:hAnsi="Times New Roman" w:eastAsia="Times New Roman" w:cs="Times New Roman"/>
-          <w:b/>
-          <w:i w:val="0"/>
-          <w:sz w:val="26"/>
-        </w:rPr>
-        <w:t>453 người tham gia</w:t>
-      </w:r>
-      <w:r>
-        <w:rPr>
-          <w:rFonts w:ascii="Times New Roman" w:hAnsi="Times New Roman" w:eastAsia="Times New Roman" w:cs="Times New Roman"/>
-          <w:b w:val="0"/>
-          <w:i w:val="0"/>
-          <w:sz w:val="26"/>
-        </w:rPr>
-        <w:t xml:space="preserve"> (chia đều 385 mỗi nhóm).</w:t>
-      </w:r>
-    </w:p>
-    <w:p>
-      <w:pPr>
-        <w:spacing w:before="280" w:after="160" w:lineRule="auto" w:line="312"/>
-      </w:pPr>
-      <w:r>
-        <w:rPr>
-          <w:rFonts w:ascii="Times New Roman" w:hAnsi="Times New Roman" w:eastAsia="Times New Roman" w:cs="Times New Roman"/>
-          <w:b/>
-          <w:i w:val="0"/>
-          <w:sz w:val="28"/>
         </w:rPr>
         <w:t>PHẦN 2b — CỠ MẪU THỰC TẾ ĐÃ CHỐT (bác sĩ/chủ nhiệm quyết định)</w:t>
       </w:r>
     </w:p>
     <w:p>
-      <w:pPr>
-        <w:spacing w:before="0" w:after="160" w:lineRule="auto" w:line="360"/>
-        <w:jc w:val="both"/>
-      </w:pPr>
       <w:r>
         <w:rPr>
-          <w:rFonts w:ascii="Times New Roman" w:hAnsi="Times New Roman" w:eastAsia="Times New Roman" w:cs="Times New Roman"/>
-          <w:b/>
-          <w:i w:val="0"/>
+          <w:rFonts w:ascii="Times New Roman" w:hAnsi="Times New Roman" w:eastAsia="Times New Roman"/>
           <w:sz w:val="26"/>
         </w:rPr>
-        <w:t>N thực tế đã chốt:</w:t>
+        <w:t>**N thực tế đã chốt:** **1000** người tham gia — quyết định của bác sĩ/chủ nhiệm đề tài (vd theo khả năng thu thập/thời gian/hành chính), KHÔNG thay thế công thức tính N tối thiểu ở PHẦN 2, chỉ ghi SONG SONG để đối chiếu.</w:t>
       </w:r>
+    </w:p>
+    <w:p>
       <w:r>
         <w:rPr>
-          <w:rFonts w:ascii="Times New Roman" w:hAnsi="Times New Roman" w:eastAsia="Times New Roman" w:cs="Times New Roman"/>
-          <w:b w:val="0"/>
-          <w:i w:val="0"/>
+          <w:rFonts w:ascii="Times New Roman" w:hAnsi="Times New Roman" w:eastAsia="Times New Roman"/>
           <w:sz w:val="26"/>
         </w:rPr>
-        <w:t xml:space="preserve"> </w:t>
+        <w:t>[Đạt] **ĐẠT** — N chốt (1000) ≥ N tối thiểu tính theo thống kê (626), đủ hoặc dư lực thống kê/độ chính xác so với yêu cầu tối thiểu. Với N=1000 (giả định p=0.50, xấu nhất), sai số biên (margin of error) 95% CI ước lượng tỷ lệ ≈ ±3.1 điểm phần trăm — chặt hơn mức tối thiểu PHẦN 2 (N tối thiểu cho ±5%).</w:t>
       </w:r>
+    </w:p>
+    <w:p>
       <w:r>
         <w:rPr>
-          <w:rFonts w:ascii="Times New Roman" w:hAnsi="Times New Roman" w:eastAsia="Times New Roman" w:cs="Times New Roman"/>
-          <w:b/>
-          <w:i w:val="0"/>
+          <w:rFonts w:ascii="Times New Roman" w:hAnsi="Times New Roman" w:eastAsia="Times New Roman"/>
           <w:sz w:val="26"/>
         </w:rPr>
-        <w:t>1000</w:t>
-      </w:r>
-      <w:r>
-        <w:rPr>
-          <w:rFonts w:ascii="Times New Roman" w:hAnsi="Times New Roman" w:eastAsia="Times New Roman" w:cs="Times New Roman"/>
-          <w:b w:val="0"/>
-          <w:i w:val="0"/>
-          <w:sz w:val="26"/>
-        </w:rPr>
-        <w:t xml:space="preserve"> người tham gia — quyết định của bác sĩ/chủ nhiệm đề tài (vd theo khả năng thu thập/thời gian/hành chính), KHÔNG thay thế công thức tính N tối thiểu ở PHẦN 2, chỉ ghi SONG SONG để đối chiếu.</w:t>
+        <w:t>---</w:t>
       </w:r>
     </w:p>
     <w:p>
       <w:pPr>
-        <w:spacing w:before="0" w:after="160" w:lineRule="auto" w:line="360"/>
-        <w:jc w:val="both"/>
+        <w:pStyle w:val="Heading2"/>
       </w:pPr>
       <w:r>
         <w:rPr>
-          <w:rFonts w:ascii="Times New Roman" w:hAnsi="Times New Roman" w:eastAsia="Times New Roman" w:cs="Times New Roman"/>
-          <w:b w:val="0"/>
-          <w:i w:val="0"/>
+          <w:rFonts w:ascii="Times New Roman" w:hAnsi="Times New Roman" w:eastAsia="Times New Roman"/>
           <w:sz w:val="26"/>
-        </w:rPr>
-        <w:t xml:space="preserve">■ </w:t>
-      </w:r>
-      <w:r>
-        <w:rPr>
-          <w:rFonts w:ascii="Times New Roman" w:hAnsi="Times New Roman" w:eastAsia="Times New Roman" w:cs="Times New Roman"/>
-          <w:b/>
-          <w:i w:val="0"/>
-          <w:sz w:val="26"/>
-        </w:rPr>
-        <w:t>ĐẠT</w:t>
-      </w:r>
-      <w:r>
-        <w:rPr>
-          <w:rFonts w:ascii="Times New Roman" w:hAnsi="Times New Roman" w:eastAsia="Times New Roman" w:cs="Times New Roman"/>
-          <w:b w:val="0"/>
-          <w:i w:val="0"/>
-          <w:sz w:val="26"/>
-        </w:rPr>
-        <w:t xml:space="preserve"> — N chốt (1000) ≥ N tối thiểu tính theo thống kê (453), đủ hoặc dư lực thống kê/độ chính xác so với yêu cầu tối thiểu. Với N=1000 (giả định p=0.50, xấu nhất), sai số biên (margin of error) 95% CI ước lượng tỷ lệ ≈ ±3.1 điểm phần trăm — chặt hơn mức tối thiểu PHẦN 2 (N tối thiểu cho ±5%).</w:t>
-      </w:r>
-    </w:p>
-    <w:p>
-      <w:pPr>
-        <w:spacing w:before="280" w:after="160" w:lineRule="auto" w:line="312"/>
-      </w:pPr>
-      <w:r>
-        <w:rPr>
-          <w:rFonts w:ascii="Times New Roman" w:hAnsi="Times New Roman" w:eastAsia="Times New Roman" w:cs="Times New Roman"/>
-          <w:b/>
-          <w:i w:val="0"/>
-          <w:sz w:val="28"/>
         </w:rPr>
         <w:t>PHẦN 3 — PHÂN TÍCH ĐỘ NHẠY (Sensitivity Analysis)</w:t>
       </w:r>
     </w:p>
     <w:p>
-      <w:pPr>
-        <w:spacing w:before="0" w:after="160" w:lineRule="auto" w:line="360"/>
-        <w:jc w:val="both"/>
-      </w:pPr>
       <w:r>
         <w:rPr>
-          <w:rFonts w:ascii="Times New Roman" w:hAnsi="Times New Roman" w:eastAsia="Times New Roman" w:cs="Times New Roman"/>
-          <w:b w:val="0"/>
-          <w:i w:val="0"/>
+          <w:rFonts w:ascii="Times New Roman" w:hAnsi="Times New Roman" w:eastAsia="Times New Roman"/>
           <w:sz w:val="26"/>
         </w:rPr>
         <w:t>Bảng: tỷ lệ ước lượng p × sai số cho phép d đến N tối thiểu (TRƯỚC khi bù 15% không trả lời)</w:t>
       </w:r>
     </w:p>
-    <w:tbl>
-      <w:tblPr>
-        <w:tblStyle w:val="TableGrid"/>
-        <w:tblW w:type="auto" w:w="0"/>
-        <w:jc w:val="center"/>
-        <w:tblLayout w:type="fixed"/>
-        <w:tblLook w:firstColumn="1" w:firstRow="1" w:lastColumn="0" w:lastRow="0" w:noHBand="0" w:noVBand="1" w:val="04A0"/>
-      </w:tblPr>
-      <w:tblGrid>
-        <w:gridCol w:w="2268"/>
-        <w:gridCol w:w="2268"/>
-        <w:gridCol w:w="2268"/>
-        <w:gridCol w:w="2268"/>
-      </w:tblGrid>
-      <w:tr>
-        <w:trPr>
-          <w:tblHeader w:val="true"/>
-        </w:trPr>
-        <w:tc>
-          <w:tcPr>
-            <w:tcW w:type="dxa" w:w="2268"/>
-            <w:vAlign w:val="top"/>
-            <w:tcMar>
-              <w:top w:w="108" w:type="dxa"/>
-              <w:left w:w="108" w:type="dxa"/>
-              <w:bottom w:w="108" w:type="dxa"/>
-              <w:right w:w="108" w:type="dxa"/>
-            </w:tcMar>
-            <w:shd w:fill="D9EAF7"/>
-          </w:tcPr>
-          <w:p>
-            <w:pPr>
-              <w:spacing w:before="40" w:after="40" w:lineRule="auto" w:line="276"/>
-              <w:jc w:val="center"/>
-            </w:pPr>
-            <w:r/>
-            <w:r>
-              <w:rPr>
-                <w:rFonts w:ascii="Times New Roman" w:hAnsi="Times New Roman" w:eastAsia="Times New Roman" w:cs="Times New Roman"/>
-                <w:b/>
-                <w:i w:val="0"/>
-                <w:sz w:val="22"/>
-              </w:rPr>
-              <w:t>p ước lượng</w:t>
-            </w:r>
-          </w:p>
-        </w:tc>
-        <w:tc>
-          <w:tcPr>
-            <w:tcW w:type="dxa" w:w="2268"/>
-            <w:vAlign w:val="top"/>
-            <w:tcMar>
-              <w:top w:w="108" w:type="dxa"/>
-              <w:left w:w="108" w:type="dxa"/>
-              <w:bottom w:w="108" w:type="dxa"/>
-              <w:right w:w="108" w:type="dxa"/>
-            </w:tcMar>
-            <w:shd w:fill="D9EAF7"/>
-          </w:tcPr>
-          <w:p>
-            <w:pPr>
-              <w:spacing w:before="40" w:after="40" w:lineRule="auto" w:line="276"/>
-              <w:jc w:val="center"/>
-            </w:pPr>
-            <w:r/>
-            <w:r>
-              <w:rPr>
-                <w:rFonts w:ascii="Times New Roman" w:hAnsi="Times New Roman" w:eastAsia="Times New Roman" w:cs="Times New Roman"/>
-                <w:b/>
-                <w:i w:val="0"/>
-                <w:sz w:val="22"/>
-              </w:rPr>
-              <w:t>d = ±3%</w:t>
-            </w:r>
-          </w:p>
-        </w:tc>
-        <w:tc>
-          <w:tcPr>
-            <w:tcW w:type="dxa" w:w="2268"/>
-            <w:vAlign w:val="top"/>
-            <w:tcMar>
-              <w:top w:w="108" w:type="dxa"/>
-              <w:left w:w="108" w:type="dxa"/>
-              <w:bottom w:w="108" w:type="dxa"/>
-              <w:right w:w="108" w:type="dxa"/>
-            </w:tcMar>
-            <w:shd w:fill="D9EAF7"/>
-          </w:tcPr>
-          <w:p>
-            <w:pPr>
-              <w:spacing w:before="40" w:after="40" w:lineRule="auto" w:line="276"/>
-              <w:jc w:val="center"/>
-            </w:pPr>
-            <w:r/>
-            <w:r>
-              <w:rPr>
-                <w:rFonts w:ascii="Times New Roman" w:hAnsi="Times New Roman" w:eastAsia="Times New Roman" w:cs="Times New Roman"/>
-                <w:b/>
-                <w:i w:val="0"/>
-                <w:sz w:val="22"/>
-              </w:rPr>
-              <w:t>d = ±5%</w:t>
-            </w:r>
-          </w:p>
-        </w:tc>
-        <w:tc>
-          <w:tcPr>
-            <w:tcW w:type="dxa" w:w="2268"/>
-            <w:vAlign w:val="top"/>
-            <w:tcMar>
-              <w:top w:w="108" w:type="dxa"/>
-              <w:left w:w="108" w:type="dxa"/>
-              <w:bottom w:w="108" w:type="dxa"/>
-              <w:right w:w="108" w:type="dxa"/>
-            </w:tcMar>
-            <w:shd w:fill="D9EAF7"/>
-          </w:tcPr>
-          <w:p>
-            <w:pPr>
-              <w:spacing w:before="40" w:after="40" w:lineRule="auto" w:line="276"/>
-              <w:jc w:val="center"/>
-            </w:pPr>
-            <w:r/>
-            <w:r>
-              <w:rPr>
-                <w:rFonts w:ascii="Times New Roman" w:hAnsi="Times New Roman" w:eastAsia="Times New Roman" w:cs="Times New Roman"/>
-                <w:b/>
-                <w:i w:val="0"/>
-                <w:sz w:val="22"/>
-              </w:rPr>
-              <w:t>d = ±10%</w:t>
-            </w:r>
-          </w:p>
-        </w:tc>
-      </w:tr>
-      <w:tr>
-        <w:tc>
-          <w:tcPr>
-            <w:tcW w:type="dxa" w:w="2268"/>
-            <w:vAlign w:val="top"/>
-            <w:tcMar>
-              <w:top w:w="108" w:type="dxa"/>
-              <w:left w:w="108" w:type="dxa"/>
-              <w:bottom w:w="108" w:type="dxa"/>
-              <w:right w:w="108" w:type="dxa"/>
-            </w:tcMar>
-          </w:tcPr>
-          <w:p>
-            <w:pPr>
-              <w:spacing w:before="40" w:after="40" w:lineRule="auto" w:line="276"/>
-              <w:jc w:val="both"/>
-            </w:pPr>
-            <w:r/>
-            <w:r>
-              <w:rPr>
-                <w:rFonts w:ascii="Times New Roman" w:hAnsi="Times New Roman" w:eastAsia="Times New Roman" w:cs="Times New Roman"/>
-                <w:b w:val="0"/>
-                <w:i w:val="0"/>
-                <w:sz w:val="22"/>
-              </w:rPr>
-              <w:t>0.10</w:t>
-            </w:r>
-          </w:p>
-        </w:tc>
-        <w:tc>
-          <w:tcPr>
-            <w:tcW w:type="dxa" w:w="2268"/>
-            <w:vAlign w:val="top"/>
-            <w:tcMar>
-              <w:top w:w="108" w:type="dxa"/>
-              <w:left w:w="108" w:type="dxa"/>
-              <w:bottom w:w="108" w:type="dxa"/>
-              <w:right w:w="108" w:type="dxa"/>
-            </w:tcMar>
-          </w:tcPr>
-          <w:p>
-            <w:pPr>
-              <w:spacing w:before="40" w:after="40" w:lineRule="auto" w:line="276"/>
-              <w:jc w:val="both"/>
-            </w:pPr>
-            <w:r/>
-            <w:r>
-              <w:rPr>
-                <w:rFonts w:ascii="Times New Roman" w:hAnsi="Times New Roman" w:eastAsia="Times New Roman" w:cs="Times New Roman"/>
-                <w:b w:val="0"/>
-                <w:i w:val="0"/>
-                <w:sz w:val="22"/>
-              </w:rPr>
-              <w:t>385</w:t>
-            </w:r>
-          </w:p>
-        </w:tc>
-        <w:tc>
-          <w:tcPr>
-            <w:tcW w:type="dxa" w:w="2268"/>
-            <w:vAlign w:val="top"/>
-            <w:tcMar>
-              <w:top w:w="108" w:type="dxa"/>
-              <w:left w:w="108" w:type="dxa"/>
-              <w:bottom w:w="108" w:type="dxa"/>
-              <w:right w:w="108" w:type="dxa"/>
-            </w:tcMar>
-          </w:tcPr>
-          <w:p>
-            <w:pPr>
-              <w:spacing w:before="40" w:after="40" w:lineRule="auto" w:line="276"/>
-              <w:jc w:val="both"/>
-            </w:pPr>
-            <w:r/>
-            <w:r>
-              <w:rPr>
-                <w:rFonts w:ascii="Times New Roman" w:hAnsi="Times New Roman" w:eastAsia="Times New Roman" w:cs="Times New Roman"/>
-                <w:b w:val="0"/>
-                <w:i w:val="0"/>
-                <w:sz w:val="22"/>
-              </w:rPr>
-              <w:t>139</w:t>
-            </w:r>
-          </w:p>
-        </w:tc>
-        <w:tc>
-          <w:tcPr>
-            <w:tcW w:type="dxa" w:w="2268"/>
-            <w:vAlign w:val="top"/>
-            <w:tcMar>
-              <w:top w:w="108" w:type="dxa"/>
-              <w:left w:w="108" w:type="dxa"/>
-              <w:bottom w:w="108" w:type="dxa"/>
-              <w:right w:w="108" w:type="dxa"/>
-            </w:tcMar>
-          </w:tcPr>
-          <w:p>
-            <w:pPr>
-              <w:spacing w:before="40" w:after="40" w:lineRule="auto" w:line="276"/>
-              <w:jc w:val="both"/>
-            </w:pPr>
-            <w:r/>
-            <w:r>
-              <w:rPr>
-                <w:rFonts w:ascii="Times New Roman" w:hAnsi="Times New Roman" w:eastAsia="Times New Roman" w:cs="Times New Roman"/>
-                <w:b w:val="0"/>
-                <w:i w:val="0"/>
-                <w:sz w:val="22"/>
-              </w:rPr>
-              <w:t>35</w:t>
-            </w:r>
-          </w:p>
-        </w:tc>
-      </w:tr>
-      <w:tr>
-        <w:tc>
-          <w:tcPr>
-            <w:tcW w:type="dxa" w:w="2268"/>
-            <w:vAlign w:val="top"/>
-            <w:tcMar>
-              <w:top w:w="108" w:type="dxa"/>
-              <w:left w:w="108" w:type="dxa"/>
-              <w:bottom w:w="108" w:type="dxa"/>
-              <w:right w:w="108" w:type="dxa"/>
-            </w:tcMar>
-          </w:tcPr>
-          <w:p>
-            <w:pPr>
-              <w:spacing w:before="40" w:after="40" w:lineRule="auto" w:line="276"/>
-              <w:jc w:val="both"/>
-            </w:pPr>
-            <w:r/>
-            <w:r>
-              <w:rPr>
-                <w:rFonts w:ascii="Times New Roman" w:hAnsi="Times New Roman" w:eastAsia="Times New Roman" w:cs="Times New Roman"/>
-                <w:b w:val="0"/>
-                <w:i w:val="0"/>
-                <w:sz w:val="22"/>
-              </w:rPr>
-              <w:t>0.30</w:t>
-            </w:r>
-          </w:p>
-        </w:tc>
-        <w:tc>
-          <w:tcPr>
-            <w:tcW w:type="dxa" w:w="2268"/>
-            <w:vAlign w:val="top"/>
-            <w:tcMar>
-              <w:top w:w="108" w:type="dxa"/>
-              <w:left w:w="108" w:type="dxa"/>
-              <w:bottom w:w="108" w:type="dxa"/>
-              <w:right w:w="108" w:type="dxa"/>
-            </w:tcMar>
-          </w:tcPr>
-          <w:p>
-            <w:pPr>
-              <w:spacing w:before="40" w:after="40" w:lineRule="auto" w:line="276"/>
-              <w:jc w:val="both"/>
-            </w:pPr>
-            <w:r/>
-            <w:r>
-              <w:rPr>
-                <w:rFonts w:ascii="Times New Roman" w:hAnsi="Times New Roman" w:eastAsia="Times New Roman" w:cs="Times New Roman"/>
-                <w:b w:val="0"/>
-                <w:i w:val="0"/>
-                <w:sz w:val="22"/>
-              </w:rPr>
-              <w:t>897</w:t>
-            </w:r>
-          </w:p>
-        </w:tc>
-        <w:tc>
-          <w:tcPr>
-            <w:tcW w:type="dxa" w:w="2268"/>
-            <w:vAlign w:val="top"/>
-            <w:tcMar>
-              <w:top w:w="108" w:type="dxa"/>
-              <w:left w:w="108" w:type="dxa"/>
-              <w:bottom w:w="108" w:type="dxa"/>
-              <w:right w:w="108" w:type="dxa"/>
-            </w:tcMar>
-          </w:tcPr>
-          <w:p>
-            <w:pPr>
-              <w:spacing w:before="40" w:after="40" w:lineRule="auto" w:line="276"/>
-              <w:jc w:val="both"/>
-            </w:pPr>
-            <w:r/>
-            <w:r>
-              <w:rPr>
-                <w:rFonts w:ascii="Times New Roman" w:hAnsi="Times New Roman" w:eastAsia="Times New Roman" w:cs="Times New Roman"/>
-                <w:b w:val="0"/>
-                <w:i w:val="0"/>
-                <w:sz w:val="22"/>
-              </w:rPr>
-              <w:t>323</w:t>
-            </w:r>
-          </w:p>
-        </w:tc>
-        <w:tc>
-          <w:tcPr>
-            <w:tcW w:type="dxa" w:w="2268"/>
-            <w:vAlign w:val="top"/>
-            <w:tcMar>
-              <w:top w:w="108" w:type="dxa"/>
-              <w:left w:w="108" w:type="dxa"/>
-              <w:bottom w:w="108" w:type="dxa"/>
-              <w:right w:w="108" w:type="dxa"/>
-            </w:tcMar>
-          </w:tcPr>
-          <w:p>
-            <w:pPr>
-              <w:spacing w:before="40" w:after="40" w:lineRule="auto" w:line="276"/>
-              <w:jc w:val="both"/>
-            </w:pPr>
-            <w:r/>
-            <w:r>
-              <w:rPr>
-                <w:rFonts w:ascii="Times New Roman" w:hAnsi="Times New Roman" w:eastAsia="Times New Roman" w:cs="Times New Roman"/>
-                <w:b w:val="0"/>
-                <w:i w:val="0"/>
-                <w:sz w:val="22"/>
-              </w:rPr>
-              <w:t>81</w:t>
-            </w:r>
-          </w:p>
-        </w:tc>
-      </w:tr>
-      <w:tr>
-        <w:tc>
-          <w:tcPr>
-            <w:tcW w:type="dxa" w:w="2268"/>
-            <w:vAlign w:val="top"/>
-            <w:tcMar>
-              <w:top w:w="108" w:type="dxa"/>
-              <w:left w:w="108" w:type="dxa"/>
-              <w:bottom w:w="108" w:type="dxa"/>
-              <w:right w:w="108" w:type="dxa"/>
-            </w:tcMar>
-          </w:tcPr>
-          <w:p>
-            <w:pPr>
-              <w:spacing w:before="40" w:after="40" w:lineRule="auto" w:line="276"/>
-              <w:jc w:val="both"/>
-            </w:pPr>
-            <w:r/>
-            <w:r>
-              <w:rPr>
-                <w:rFonts w:ascii="Times New Roman" w:hAnsi="Times New Roman" w:eastAsia="Times New Roman" w:cs="Times New Roman"/>
-                <w:b w:val="0"/>
-                <w:i w:val="0"/>
-                <w:sz w:val="22"/>
-              </w:rPr>
-              <w:t>0.50 (cơ sở)</w:t>
-            </w:r>
-          </w:p>
-        </w:tc>
-        <w:tc>
-          <w:tcPr>
-            <w:tcW w:type="dxa" w:w="2268"/>
-            <w:vAlign w:val="top"/>
-            <w:tcMar>
-              <w:top w:w="108" w:type="dxa"/>
-              <w:left w:w="108" w:type="dxa"/>
-              <w:bottom w:w="108" w:type="dxa"/>
-              <w:right w:w="108" w:type="dxa"/>
-            </w:tcMar>
-          </w:tcPr>
-          <w:p>
-            <w:pPr>
-              <w:spacing w:before="40" w:after="40" w:lineRule="auto" w:line="276"/>
-              <w:jc w:val="both"/>
-            </w:pPr>
-            <w:r/>
-            <w:r>
-              <w:rPr>
-                <w:rFonts w:ascii="Times New Roman" w:hAnsi="Times New Roman" w:eastAsia="Times New Roman" w:cs="Times New Roman"/>
-                <w:b w:val="0"/>
-                <w:i w:val="0"/>
-                <w:sz w:val="22"/>
-              </w:rPr>
-              <w:t>1068</w:t>
-            </w:r>
-          </w:p>
-        </w:tc>
-        <w:tc>
-          <w:tcPr>
-            <w:tcW w:type="dxa" w:w="2268"/>
-            <w:vAlign w:val="top"/>
-            <w:tcMar>
-              <w:top w:w="108" w:type="dxa"/>
-              <w:left w:w="108" w:type="dxa"/>
-              <w:bottom w:w="108" w:type="dxa"/>
-              <w:right w:w="108" w:type="dxa"/>
-            </w:tcMar>
-          </w:tcPr>
-          <w:p>
-            <w:pPr>
-              <w:spacing w:before="40" w:after="40" w:lineRule="auto" w:line="276"/>
-              <w:jc w:val="both"/>
-            </w:pPr>
-            <w:r/>
-            <w:r>
-              <w:rPr>
-                <w:rFonts w:ascii="Times New Roman" w:hAnsi="Times New Roman" w:eastAsia="Times New Roman" w:cs="Times New Roman"/>
-                <w:b w:val="0"/>
-                <w:i w:val="0"/>
-                <w:sz w:val="22"/>
-              </w:rPr>
-              <w:t>385</w:t>
-            </w:r>
-          </w:p>
-        </w:tc>
-        <w:tc>
-          <w:tcPr>
-            <w:tcW w:type="dxa" w:w="2268"/>
-            <w:vAlign w:val="top"/>
-            <w:tcMar>
-              <w:top w:w="108" w:type="dxa"/>
-              <w:left w:w="108" w:type="dxa"/>
-              <w:bottom w:w="108" w:type="dxa"/>
-              <w:right w:w="108" w:type="dxa"/>
-            </w:tcMar>
-          </w:tcPr>
-          <w:p>
-            <w:pPr>
-              <w:spacing w:before="40" w:after="40" w:lineRule="auto" w:line="276"/>
-              <w:jc w:val="both"/>
-            </w:pPr>
-            <w:r/>
-            <w:r>
-              <w:rPr>
-                <w:rFonts w:ascii="Times New Roman" w:hAnsi="Times New Roman" w:eastAsia="Times New Roman" w:cs="Times New Roman"/>
-                <w:b w:val="0"/>
-                <w:i w:val="0"/>
-                <w:sz w:val="22"/>
-              </w:rPr>
-              <w:t>97</w:t>
-            </w:r>
-          </w:p>
-        </w:tc>
-      </w:tr>
-    </w:tbl>
-    <w:p/>
     <w:p>
-      <w:pPr>
-        <w:spacing w:before="120" w:after="200" w:lineRule="auto" w:line="312"/>
-        <w:jc w:val="both"/>
-        <w:ind w:left="567" w:right="567"/>
-      </w:pPr>
       <w:r>
         <w:rPr>
-          <w:rFonts w:ascii="Times New Roman" w:hAnsi="Times New Roman" w:eastAsia="Times New Roman" w:cs="Times New Roman"/>
-          <w:b w:val="0"/>
-          <w:i/>
-          <w:sz w:val="22"/>
+          <w:rFonts w:ascii="Times New Roman" w:hAnsi="Times New Roman" w:eastAsia="Times New Roman"/>
+          <w:sz w:val="26"/>
         </w:rPr>
-        <w:t>p = 0,50 cho N lớn nhất vì phương sai p(1−p) đạt cực đại tại đó; đây là lựa chọn thận trọng khi chưa biết tỷ lệ thật. Thu hẹp d làm N tăng nhanh theo bình phương.</w:t>
+        <w:t>| p ước lượng | d = ±2.5% | d = ±5% | d = ±10% |</w:t>
+      </w:r>
+    </w:p>
+    <w:p>
+      <w:r>
+        <w:rPr>
+          <w:rFonts w:ascii="Times New Roman" w:hAnsi="Times New Roman" w:eastAsia="Times New Roman"/>
+          <w:sz w:val="26"/>
+        </w:rPr>
+        <w:t>|---|---|---|---|</w:t>
+      </w:r>
+    </w:p>
+    <w:p>
+      <w:r>
+        <w:rPr>
+          <w:rFonts w:ascii="Times New Roman" w:hAnsi="Times New Roman" w:eastAsia="Times New Roman"/>
+          <w:sz w:val="26"/>
+        </w:rPr>
+        <w:t>| 0.10 | 554 | 139 | 35 |</w:t>
+      </w:r>
+    </w:p>
+    <w:p>
+      <w:r>
+        <w:rPr>
+          <w:rFonts w:ascii="Times New Roman" w:hAnsi="Times New Roman" w:eastAsia="Times New Roman"/>
+          <w:sz w:val="26"/>
+        </w:rPr>
+        <w:t>| 0.30 | 1291 | 323 | 81 |</w:t>
+      </w:r>
+    </w:p>
+    <w:p>
+      <w:r>
+        <w:rPr>
+          <w:rFonts w:ascii="Times New Roman" w:hAnsi="Times New Roman" w:eastAsia="Times New Roman"/>
+          <w:sz w:val="26"/>
+        </w:rPr>
+        <w:t>| 0.50 (cơ sở) | 1537 | 385 | 97 |</w:t>
+      </w:r>
+    </w:p>
+    <w:p>
+      <w:r>
+        <w:rPr>
+          <w:rFonts w:ascii="Times New Roman" w:hAnsi="Times New Roman" w:eastAsia="Times New Roman"/>
+          <w:sz w:val="26"/>
+        </w:rPr>
+        <w:t>&gt; *p = 0,50 cho N lớn nhất vì phương sai p(1−p) đạt cực đại tại đó; đây là lựa chọn thận trọng khi chưa biết tỷ lệ thật. Thu hẹp d làm N tăng nhanh theo bình phương.*</w:t>
+      </w:r>
+    </w:p>
+    <w:p>
+      <w:r>
+        <w:rPr>
+          <w:rFonts w:ascii="Times New Roman" w:hAnsi="Times New Roman" w:eastAsia="Times New Roman"/>
+          <w:sz w:val="26"/>
+        </w:rPr>
+        <w:t>---</w:t>
       </w:r>
     </w:p>
     <w:p>
       <w:pPr>
-        <w:spacing w:before="280" w:after="160" w:lineRule="auto" w:line="312"/>
+        <w:pStyle w:val="Heading2"/>
       </w:pPr>
       <w:r>
         <w:rPr>
-          <w:rFonts w:ascii="Times New Roman" w:hAnsi="Times New Roman" w:eastAsia="Times New Roman" w:cs="Times New Roman"/>
-          <w:b/>
-          <w:i w:val="0"/>
-          <w:sz w:val="28"/>
+          <w:rFonts w:ascii="Times New Roman" w:hAnsi="Times New Roman" w:eastAsia="Times New Roman"/>
+          <w:sz w:val="26"/>
         </w:rPr>
         <w:t>PHẦN 4 — KHỐI CỠ MẪU (dán vào đề cương)</w:t>
       </w:r>
     </w:p>
     <w:p>
-      <w:pPr>
-        <w:spacing w:before="0" w:after="160" w:lineRule="auto" w:line="360"/>
-        <w:jc w:val="both"/>
-      </w:pPr>
       <w:r>
         <w:rPr>
-          <w:rFonts w:ascii="Times New Roman" w:hAnsi="Times New Roman" w:eastAsia="Times New Roman" w:cs="Times New Roman"/>
-          <w:b w:val="0"/>
-          <w:i w:val="0"/>
+          <w:rFonts w:ascii="Times New Roman" w:hAnsi="Times New Roman" w:eastAsia="Times New Roman"/>
           <w:sz w:val="26"/>
         </w:rPr>
-        <w:t>Cỡ mẫu được tính theo Cỡ mẫu ước lượng một tỷ lệ theo độ chính xác (Lwanga &amp; Lemeshow/Cochran, xấp xỉ chuẩn): tỷ lệ hiện mắc ước lượng p=0.50, sai số cho phép d=0.05, alpha=0.05.</w:t>
+        <w:t>```</w:t>
       </w:r>
     </w:p>
     <w:p>
-      <w:pPr>
-        <w:spacing w:before="0" w:after="160" w:lineRule="auto" w:line="360"/>
-        <w:jc w:val="both"/>
-      </w:pPr>
       <w:r>
         <w:rPr>
-          <w:rFonts w:ascii="Times New Roman" w:hAnsi="Times New Roman" w:eastAsia="Times New Roman" w:cs="Times New Roman"/>
-          <w:b w:val="0"/>
-          <w:i w:val="0"/>
+          <w:rFonts w:ascii="Times New Roman" w:hAnsi="Times New Roman" w:eastAsia="Times New Roman"/>
           <w:sz w:val="26"/>
         </w:rPr>
-        <w:t>Với mức ý nghĩa two-sided α = 0.05, lực thống kê 1−β = 80%,</w:t>
+        <w:t>Cỡ mẫu được tính theo Cỡ mẫu ước lượng một tỷ lệ theo độ chính xác (Lwanga &amp; Lemeshow/Cochran, xấp xỉ chuẩn): tỷ lệ hiện mắc ước lượng p=0.50, sai số cho phép d=0.05, alpha=0.05 Đã áp design effect cụm (DE=1+(m-1)×ICC=1.38, m=20, ICC=0.02): n 385 đến 532 (~27 cụm)..</w:t>
       </w:r>
     </w:p>
     <w:p>
-      <w:pPr>
-        <w:spacing w:before="0" w:after="160" w:lineRule="auto" w:line="360"/>
-        <w:jc w:val="both"/>
-      </w:pPr>
       <w:r>
         <w:rPr>
-          <w:rFonts w:ascii="Times New Roman" w:hAnsi="Times New Roman" w:eastAsia="Times New Roman" w:cs="Times New Roman"/>
-          <w:b w:val="0"/>
-          <w:i w:val="0"/>
+          <w:rFonts w:ascii="Times New Roman" w:hAnsi="Times New Roman" w:eastAsia="Times New Roman"/>
           <w:sz w:val="26"/>
         </w:rPr>
-        <w:t>với tỷ lệ hiện mắc giả định p = 0.50 (</w:t>
-      </w:r>
-      <w:r>
-        <w:rPr>
-          <w:rFonts w:ascii="Times New Roman" w:hAnsi="Times New Roman" w:eastAsia="Times New Roman" w:cs="Times New Roman"/>
-          <w:b/>
-          <w:i/>
-          <w:color w:val="CC7700"/>
-          <w:sz w:val="26"/>
-        </w:rPr>
-        <w:t>[CẦN bác sĩ xác nhận — dùng p=0.50 theo quy ước thận trọng nếu chưa có ước tính từ khảo sát tương tự tại cơ sở/khu vực; nếu có số liệu sơ bộ/y văn gần đây, thay p bằng ước tính đó để cỡ mẫu sát thực tế hơn]</w:t>
-      </w:r>
-      <w:r>
-        <w:rPr>
-          <w:rFonts w:ascii="Times New Roman" w:hAnsi="Times New Roman" w:eastAsia="Times New Roman" w:cs="Times New Roman"/>
-          <w:b w:val="0"/>
-          <w:i w:val="0"/>
-          <w:sz w:val="26"/>
-        </w:rPr>
-        <w:t>),</w:t>
+        <w:t>Với độ tin cậy 95% (α = 0.05) và sai số tuyệt đối cho phép d = ±5%,</w:t>
       </w:r>
     </w:p>
     <w:p>
-      <w:pPr>
-        <w:spacing w:before="0" w:after="160" w:lineRule="auto" w:line="360"/>
-        <w:jc w:val="both"/>
-      </w:pPr>
       <w:r>
         <w:rPr>
-          <w:rFonts w:ascii="Times New Roman" w:hAnsi="Times New Roman" w:eastAsia="Times New Roman" w:cs="Times New Roman"/>
-          <w:b w:val="0"/>
-          <w:i w:val="0"/>
+          <w:rFonts w:ascii="Times New Roman" w:hAnsi="Times New Roman" w:eastAsia="Times New Roman"/>
           <w:sz w:val="26"/>
         </w:rPr>
-        <w:t>cần 385 người mỗi nhóm (N tổng = 385).</w:t>
+        <w:t>với tỷ lệ ước lượng p = 0.50 (Quy ước thận trọng p = 0,50 — giá trị làm phương sai p(1-p) lớn nhất nên cho cỡ mẫu lớn nhất; dùng khi chưa có ước lượng tỷ lệ hài lòng tại chính Khoa C1a. Nguồn công thức: Lwanga SK, Lemeshow S. Sample size determination in health studies: a practical manual. WHO, 1991 (mục 4.4.1 đề cương)),</w:t>
       </w:r>
     </w:p>
     <w:p>
-      <w:pPr>
-        <w:spacing w:before="0" w:after="160" w:lineRule="auto" w:line="360"/>
-        <w:jc w:val="both"/>
-      </w:pPr>
       <w:r>
         <w:rPr>
-          <w:rFonts w:ascii="Times New Roman" w:hAnsi="Times New Roman" w:eastAsia="Times New Roman" w:cs="Times New Roman"/>
-          <w:b w:val="0"/>
-          <w:i w:val="0"/>
+          <w:rFonts w:ascii="Times New Roman" w:hAnsi="Times New Roman" w:eastAsia="Times New Roman"/>
           <w:sz w:val="26"/>
         </w:rPr>
-        <w:t>Tính thêm 15% bỏ cuộc dự kiến, cỡ mẫu cuối = 453 người.</w:t>
+        <w:t>cần 532 người.</w:t>
       </w:r>
     </w:p>
     <w:p>
-      <w:pPr>
-        <w:spacing w:before="0" w:after="160" w:lineRule="auto" w:line="360"/>
-        <w:jc w:val="both"/>
-      </w:pPr>
       <w:r>
         <w:rPr>
-          <w:rFonts w:ascii="Times New Roman" w:hAnsi="Times New Roman" w:eastAsia="Times New Roman" w:cs="Times New Roman"/>
-          <w:b w:val="0"/>
-          <w:i w:val="0"/>
+          <w:rFonts w:ascii="Times New Roman" w:hAnsi="Times New Roman" w:eastAsia="Times New Roman"/>
+          <w:sz w:val="26"/>
+        </w:rPr>
+        <w:t>Tính thêm 15% không trả lời dự kiến, cỡ mẫu cuối = 626 người.</w:t>
+      </w:r>
+    </w:p>
+    <w:p>
+      <w:r>
+        <w:rPr>
+          <w:rFonts w:ascii="Times New Roman" w:hAnsi="Times New Roman" w:eastAsia="Times New Roman"/>
           <w:sz w:val="26"/>
         </w:rPr>
         <w:t>N THỰC TẾ đã được bác sĩ/chủ nhiệm CHỐT = 1000 người (≥ N tối thiểu tính toán).</w:t>
       </w:r>
     </w:p>
     <w:p>
-      <w:pPr>
-        <w:spacing w:before="120" w:after="200" w:lineRule="auto" w:line="312"/>
-        <w:jc w:val="both"/>
-        <w:ind w:left="567" w:right="567"/>
-      </w:pPr>
       <w:r>
         <w:rPr>
-          <w:rFonts w:ascii="Times New Roman" w:hAnsi="Times New Roman" w:eastAsia="Times New Roman" w:cs="Times New Roman"/>
-          <w:b w:val="0"/>
-          <w:i/>
-          <w:sz w:val="22"/>
+          <w:rFonts w:ascii="Times New Roman" w:hAnsi="Times New Roman" w:eastAsia="Times New Roman"/>
+          <w:sz w:val="26"/>
         </w:rPr>
-        <w:t xml:space="preserve">Trình bày cỡ mẫu theo mục cỡ mẫu của </w:t>
+        <w:t>```</w:t>
       </w:r>
+    </w:p>
+    <w:p>
       <w:r>
         <w:rPr>
-          <w:rFonts w:ascii="Times New Roman" w:hAnsi="Times New Roman" w:eastAsia="Times New Roman" w:cs="Times New Roman"/>
-          <w:b/>
-          <w:i/>
-          <w:sz w:val="22"/>
+          <w:rFonts w:ascii="Times New Roman" w:hAnsi="Times New Roman" w:eastAsia="Times New Roman"/>
+          <w:sz w:val="26"/>
         </w:rPr>
-        <w:t>STROBE</w:t>
+        <w:t>&gt; Trình bày cỡ mẫu theo mục cỡ mẫu của **STROBE** khi đưa vào đề cương/bản thảo (vd CONSORT 2025 mục 16a, SPIRIT 2025 mục 19, STROBE mục 10, STARD 2015 mục 18, TRIPOD+AI mục 10 — tùy thiết kế).</w:t>
       </w:r>
+    </w:p>
+    <w:p>
       <w:r>
         <w:rPr>
-          <w:rFonts w:ascii="Times New Roman" w:hAnsi="Times New Roman" w:eastAsia="Times New Roman" w:cs="Times New Roman"/>
-          <w:b w:val="0"/>
-          <w:i/>
-          <w:sz w:val="22"/>
+          <w:rFonts w:ascii="Times New Roman" w:hAnsi="Times New Roman" w:eastAsia="Times New Roman"/>
+          <w:sz w:val="26"/>
         </w:rPr>
-        <w:t xml:space="preserve"> khi đưa vào đề cương/bản thảo (vd CONSORT 2025 mục 16a, SPIRIT 2025 mục 19, STROBE mục 10, STARD 2015 mục 18, TRIPOD+AI mục 10 — tùy thiết kế).</w:t>
+        <w:t>---</w:t>
       </w:r>
     </w:p>
     <w:p>
       <w:pPr>
-        <w:spacing w:before="280" w:after="160" w:lineRule="auto" w:line="312"/>
+        <w:pStyle w:val="Heading2"/>
       </w:pPr>
       <w:r>
         <w:rPr>
-          <w:rFonts w:ascii="Times New Roman" w:hAnsi="Times New Roman" w:eastAsia="Times New Roman" w:cs="Times New Roman"/>
-          <w:b/>
-          <w:i w:val="0"/>
-          <w:sz w:val="28"/>
+          <w:rFonts w:ascii="Times New Roman" w:hAnsi="Times New Roman" w:eastAsia="Times New Roman"/>
+          <w:sz w:val="26"/>
         </w:rPr>
         <w:t>PHẦN 5 — TIÊU CHÍ QUA CỔNG G3</w:t>
       </w:r>
     </w:p>
     <w:p>
-      <w:pPr>
-        <w:pStyle w:val="ListBullet"/>
-        <w:spacing w:before="0" w:after="80" w:lineRule="auto" w:line="360"/>
-        <w:jc w:val="both"/>
-      </w:pPr>
       <w:r>
         <w:rPr>
-          <w:rFonts w:ascii="Times New Roman" w:hAnsi="Times New Roman" w:eastAsia="Times New Roman" w:cs="Times New Roman"/>
-          <w:b w:val="0"/>
-          <w:i w:val="0"/>
+          <w:rFonts w:ascii="Times New Roman" w:hAnsi="Times New Roman" w:eastAsia="Times New Roman"/>
+          <w:color w:val="CC4400"/>
           <w:sz w:val="26"/>
         </w:rPr>
-        <w:t>[ ]</w:t>
-      </w:r>
-      <w:r>
-        <w:rPr>
-          <w:rFonts w:ascii="Times New Roman" w:hAnsi="Times New Roman" w:eastAsia="Times New Roman" w:cs="Times New Roman"/>
-          <w:b w:val="0"/>
-          <w:i w:val="0"/>
-          <w:sz w:val="26"/>
-        </w:rPr>
-        <w:t xml:space="preserve"> Bác sĩ xác nhận effect size (nguồn: PMID/DOI) </w:t>
-      </w:r>
-      <w:r>
-        <w:rPr>
-          <w:rFonts w:ascii="Times New Roman" w:hAnsi="Times New Roman" w:eastAsia="Times New Roman" w:cs="Times New Roman"/>
-          <w:b/>
-          <w:i/>
-          <w:color w:val="CC7700"/>
-          <w:sz w:val="26"/>
-        </w:rPr>
-        <w:t>[CẦN BÁC SĨ]</w:t>
+        <w:t>- [ ] Bác sĩ xác nhận effect size (nguồn: PMID/DOI) [CẦN BÁC SĨ]</w:t>
       </w:r>
     </w:p>
     <w:p>
-      <w:pPr>
-        <w:pStyle w:val="ListBullet"/>
-        <w:spacing w:before="0" w:after="80" w:lineRule="auto" w:line="360"/>
-        <w:jc w:val="both"/>
-      </w:pPr>
       <w:r>
         <w:rPr>
-          <w:rFonts w:ascii="Times New Roman" w:hAnsi="Times New Roman" w:eastAsia="Times New Roman" w:cs="Times New Roman"/>
-          <w:b w:val="0"/>
-          <w:i w:val="0"/>
+          <w:rFonts w:ascii="Times New Roman" w:hAnsi="Times New Roman" w:eastAsia="Times New Roman"/>
+          <w:color w:val="CC4400"/>
           <w:sz w:val="26"/>
         </w:rPr>
-        <w:t>[ ]</w:t>
-      </w:r>
-      <w:r>
-        <w:rPr>
-          <w:rFonts w:ascii="Times New Roman" w:hAnsi="Times New Roman" w:eastAsia="Times New Roman" w:cs="Times New Roman"/>
-          <w:b w:val="0"/>
-          <w:i w:val="0"/>
-          <w:sz w:val="26"/>
-        </w:rPr>
-        <w:t xml:space="preserve"> Bác sĩ xác nhận tỷ lệ dropout </w:t>
-      </w:r>
-      <w:r>
-        <w:rPr>
-          <w:rFonts w:ascii="Times New Roman" w:hAnsi="Times New Roman" w:eastAsia="Times New Roman" w:cs="Times New Roman"/>
-          <w:b/>
-          <w:i/>
-          <w:color w:val="CC7700"/>
-          <w:sz w:val="26"/>
-        </w:rPr>
-        <w:t>[CẦN BÁC SĨ]</w:t>
+        <w:t>- [ ] Bác sĩ xác nhận tỷ lệ dropout [CẦN BÁC SĨ]</w:t>
       </w:r>
     </w:p>
     <w:p>
-      <w:pPr>
-        <w:pStyle w:val="ListBullet"/>
-        <w:spacing w:before="0" w:after="80" w:lineRule="auto" w:line="360"/>
-        <w:jc w:val="both"/>
-      </w:pPr>
       <w:r>
         <w:rPr>
-          <w:rFonts w:ascii="Times New Roman" w:hAnsi="Times New Roman" w:eastAsia="Times New Roman" w:cs="Times New Roman"/>
-          <w:b w:val="0"/>
-          <w:i w:val="0"/>
+          <w:rFonts w:ascii="Times New Roman" w:hAnsi="Times New Roman" w:eastAsia="Times New Roman"/>
+          <w:color w:val="CC4400"/>
           <w:sz w:val="26"/>
         </w:rPr>
-        <w:t>[ ]</w:t>
-      </w:r>
-      <w:r>
-        <w:rPr>
-          <w:rFonts w:ascii="Times New Roman" w:hAnsi="Times New Roman" w:eastAsia="Times New Roman" w:cs="Times New Roman"/>
-          <w:b w:val="0"/>
-          <w:i w:val="0"/>
-          <w:sz w:val="26"/>
-        </w:rPr>
-        <w:t xml:space="preserve"> Bác sĩ xác nhận tỷ lệ biến cố nền (với thiết kế sống còn) </w:t>
-      </w:r>
-      <w:r>
-        <w:rPr>
-          <w:rFonts w:ascii="Times New Roman" w:hAnsi="Times New Roman" w:eastAsia="Times New Roman" w:cs="Times New Roman"/>
-          <w:b/>
-          <w:i/>
-          <w:color w:val="CC7700"/>
-          <w:sz w:val="26"/>
-        </w:rPr>
-        <w:t>[CẦN BÁC SĨ]</w:t>
+        <w:t>- [ ] Bác sĩ xác nhận tỷ lệ biến cố nền (với thiết kế sống còn) [CẦN BÁC SĨ]</w:t>
       </w:r>
     </w:p>
     <w:p>
-      <w:pPr>
-        <w:pStyle w:val="ListBullet"/>
-        <w:spacing w:before="0" w:after="80" w:lineRule="auto" w:line="360"/>
-        <w:jc w:val="both"/>
-      </w:pPr>
       <w:r>
         <w:rPr>
-          <w:rFonts w:ascii="Times New Roman" w:hAnsi="Times New Roman" w:eastAsia="Times New Roman" w:cs="Times New Roman"/>
-          <w:b w:val="0"/>
-          <w:i w:val="0"/>
+          <w:rFonts w:ascii="Times New Roman" w:hAnsi="Times New Roman" w:eastAsia="Times New Roman"/>
           <w:sz w:val="26"/>
         </w:rPr>
-        <w:t>[ ]</w:t>
-      </w:r>
-      <w:r>
-        <w:rPr>
-          <w:rFonts w:ascii="Times New Roman" w:hAnsi="Times New Roman" w:eastAsia="Times New Roman" w:cs="Times New Roman"/>
-          <w:b w:val="0"/>
-          <w:i w:val="0"/>
-          <w:sz w:val="26"/>
-        </w:rPr>
-        <w:t xml:space="preserve"> Cập nhật G3_checkpoint.json với N đã duyệt</w:t>
+        <w:t>- [ ] Cập nhật G3_checkpoint.json với N đã duyệt</w:t>
       </w:r>
     </w:p>
     <w:p>
-      <w:pPr>
-        <w:pStyle w:val="ListBullet"/>
-        <w:spacing w:before="0" w:after="80" w:lineRule="auto" w:line="360"/>
-        <w:jc w:val="both"/>
-      </w:pPr>
       <w:r>
         <w:rPr>
-          <w:rFonts w:ascii="Times New Roman" w:hAnsi="Times New Roman" w:eastAsia="Times New Roman" w:cs="Times New Roman"/>
-          <w:b w:val="0"/>
-          <w:i w:val="0"/>
+          <w:rFonts w:ascii="Times New Roman" w:hAnsi="Times New Roman" w:eastAsia="Times New Roman"/>
           <w:sz w:val="26"/>
         </w:rPr>
-        <w:t>[ ]</w:t>
-      </w:r>
-      <w:r>
-        <w:rPr>
-          <w:rFonts w:ascii="Times New Roman" w:hAnsi="Times New Roman" w:eastAsia="Times New Roman" w:cs="Times New Roman"/>
-          <w:b w:val="0"/>
-          <w:i w:val="0"/>
-          <w:sz w:val="26"/>
-        </w:rPr>
-        <w:t xml:space="preserve"> Copy khối cỡ mẫu vào đề cương (PHẦN 4)</w:t>
+        <w:t>- [ ] Copy khối cỡ mẫu vào đề cương (PHẦN 4)</w:t>
       </w:r>
     </w:p>
     <w:p>
-      <w:pPr>
-        <w:spacing w:before="0" w:after="160" w:lineRule="auto" w:line="360"/>
-        <w:jc w:val="both"/>
-      </w:pPr>
       <w:r>
         <w:rPr>
-          <w:rFonts w:ascii="Times New Roman" w:hAnsi="Times New Roman" w:eastAsia="Times New Roman" w:cs="Times New Roman"/>
-          <w:b w:val="0"/>
-          <w:i/>
+          <w:rFonts w:ascii="Times New Roman" w:hAnsi="Times New Roman" w:eastAsia="Times New Roman"/>
           <w:sz w:val="26"/>
         </w:rPr>
-        <w:t>Cần bác sĩ kiểm chứng. Mọi số liệu cỡ mẫu phải được bác sĩ duyệt trước khi đưa vào đề cương chính thức.</w:t>
+        <w:t>---</w:t>
+      </w:r>
+    </w:p>
+    <w:p>
+      <w:r>
+        <w:rPr>
+          <w:rFonts w:ascii="Times New Roman" w:hAnsi="Times New Roman" w:eastAsia="Times New Roman"/>
+          <w:sz w:val="26"/>
+        </w:rPr>
+        <w:t>*Cần bác sĩ kiểm chứng. Mọi số liệu cỡ mẫu phải được bác sĩ duyệt trước khi đưa vào đề cương chính thức.*</w:t>
       </w:r>
     </w:p>
     <w:sectPr>
-      <w:footerReference w:type="default" r:id="rId9"/>
-      <w:pgSz w:w="11906" w:h="16838"/>
-      <w:pgMar w:top="1417" w:right="1134" w:bottom="1417" w:left="1701" w:header="720" w:footer="720" w:gutter="0"/>
+      <w:pgSz w:w="12240" w:h="15840"/>
+      <w:pgMar w:top="1440" w:right="1800" w:bottom="1440" w:left="1800" w:header="720" w:footer="720" w:gutter="0"/>
       <w:cols w:space="720"/>
       <w:docGrid w:linePitch="360"/>
     </w:sectPr>
   </w:body>
 </w:document>
-</file>
-
-<file path=word/footer1.xml><?xml version="1.0" encoding="utf-8"?>
-<w:ftr xmlns:m="http://schemas.openxmlformats.org/officeDocument/2006/math" xmlns:mc="http://schemas.openxmlformats.org/markup-compatibility/2006" xmlns:mo="http://schemas.microsoft.com/office/mac/office/2008/main" xmlns:mv="urn:schemas-microsoft-com:mac:vml" xmlns:o="urn:schemas-microsoft-com:office:office" xmlns:r="http://schemas.openxmlformats.org/officeDocument/2006/relationships" xmlns:v="urn:schemas-microsoft-com:vml" xmlns:w10="urn:schemas-microsoft-com:office:word" xmlns:w14="http://schemas.microsoft.com/office/word/2010/wordml" xmlns:w="http://schemas.openxmlformats.org/wordprocessingml/2006/main" xmlns:wne="http://schemas.microsoft.com/office/word/2006/wordml" xmlns:wp14="http://schemas.microsoft.com/office/word/2010/wordprocessingDrawing" xmlns:wp="http://schemas.openxmlformats.org/drawingml/2006/wordprocessingDrawing" xmlns:wpc="http://schemas.microsoft.com/office/word/2010/wordprocessingCanvas" xmlns:wpg="http://schemas.microsoft.com/office/word/2010/wordprocessingGroup" xmlns:wpi="http://schemas.microsoft.com/office/word/2010/wordprocessingInk" xmlns:wps="http://schemas.microsoft.com/office/word/2010/wordprocessingShape" mc:Ignorable="w14 wp14">
-  <w:p>
-    <w:pPr>
-      <w:pStyle w:val="Footer"/>
-      <w:spacing w:before="0" w:after="0" w:lineRule="auto" w:line="240"/>
-      <w:jc w:val="center"/>
-    </w:pPr>
-    <w:r>
-      <w:rPr>
-        <w:rFonts w:ascii="Times New Roman" w:hAnsi="Times New Roman" w:eastAsia="Times New Roman" w:cs="Times New Roman"/>
-        <w:b w:val="0"/>
-        <w:i w:val="0"/>
-        <w:sz w:val="20"/>
-      </w:rPr>
-      <w:t xml:space="preserve">Trang </w:t>
-    </w:r>
-    <w:r>
-      <w:rPr>
-        <w:rFonts w:ascii="Times New Roman" w:hAnsi="Times New Roman" w:eastAsia="Times New Roman" w:cs="Times New Roman"/>
-        <w:b w:val="0"/>
-        <w:i w:val="0"/>
-        <w:sz w:val="20"/>
-      </w:rPr>
-      <w:fldChar w:fldCharType="begin"/>
-      <w:instrText xml:space="preserve">PAGE</w:instrText>
-      <w:fldChar w:fldCharType="separate"/>
-      <w:fldChar w:fldCharType="end"/>
-    </w:r>
-  </w:p>
-</w:ftr>
 </file>
 
 <file path=word/numbering.xml><?xml version="1.0" encoding="utf-8"?>
@@ -2458,7 +890,7 @@
     <w:qFormat/>
     <w:rsid w:val="00FC693F"/>
     <w:rPr>
-      <w:rFonts w:ascii="Times New Roman" w:hAnsi="Times New Roman" w:eastAsia="Times New Roman" w:cs="Times New Roman"/>
+      <w:rFonts w:ascii="Times New Roman" w:hAnsi="Times New Roman" w:eastAsia="Times New Roman"/>
       <w:sz w:val="26"/>
     </w:rPr>
   </w:style>
@@ -2521,11 +953,11 @@
       <w:outlineLvl w:val="0"/>
     </w:pPr>
     <w:rPr>
-      <w:rFonts w:asciiTheme="majorHAnsi" w:eastAsiaTheme="majorEastAsia" w:hAnsiTheme="majorHAnsi" w:cstheme="majorBidi"/>
+      <w:rFonts w:asciiTheme="majorHAnsi" w:eastAsiaTheme="majorEastAsia" w:hAnsiTheme="majorHAnsi" w:cstheme="majorBidi" w:ascii="Times New Roman" w:hAnsi="Times New Roman" w:eastAsia="Times New Roman"/>
       <w:b/>
       <w:bCs/>
       <w:color w:val="365F91" w:themeColor="accent1" w:themeShade="BF"/>
-      <w:sz w:val="28"/>
+      <w:sz w:val="32"/>
       <w:szCs w:val="28"/>
     </w:rPr>
   </w:style>
@@ -2545,11 +977,11 @@
       <w:outlineLvl w:val="1"/>
     </w:pPr>
     <w:rPr>
-      <w:rFonts w:asciiTheme="majorHAnsi" w:eastAsiaTheme="majorEastAsia" w:hAnsiTheme="majorHAnsi" w:cstheme="majorBidi"/>
+      <w:rFonts w:asciiTheme="majorHAnsi" w:eastAsiaTheme="majorEastAsia" w:hAnsiTheme="majorHAnsi" w:cstheme="majorBidi" w:ascii="Times New Roman" w:hAnsi="Times New Roman" w:eastAsia="Times New Roman"/>
       <w:b/>
       <w:bCs/>
       <w:color w:val="4F81BD" w:themeColor="accent1"/>
-      <w:sz w:val="26"/>
+      <w:sz w:val="30"/>
       <w:szCs w:val="26"/>
     </w:rPr>
   </w:style>
@@ -2569,10 +1001,11 @@
       <w:outlineLvl w:val="2"/>
     </w:pPr>
     <w:rPr>
-      <w:rFonts w:asciiTheme="majorHAnsi" w:eastAsiaTheme="majorEastAsia" w:hAnsiTheme="majorHAnsi" w:cstheme="majorBidi"/>
+      <w:rFonts w:asciiTheme="majorHAnsi" w:eastAsiaTheme="majorEastAsia" w:hAnsiTheme="majorHAnsi" w:cstheme="majorBidi" w:ascii="Times New Roman" w:hAnsi="Times New Roman" w:eastAsia="Times New Roman"/>
       <w:b/>
       <w:bCs/>
       <w:color w:val="4F81BD" w:themeColor="accent1"/>
+      <w:sz w:val="28"/>
     </w:rPr>
   </w:style>
   <w:style w:type="paragraph" w:styleId="Heading4">
@@ -2592,12 +1025,13 @@
       <w:outlineLvl w:val="3"/>
     </w:pPr>
     <w:rPr>
-      <w:rFonts w:asciiTheme="majorHAnsi" w:eastAsiaTheme="majorEastAsia" w:hAnsiTheme="majorHAnsi" w:cstheme="majorBidi"/>
+      <w:rFonts w:asciiTheme="majorHAnsi" w:eastAsiaTheme="majorEastAsia" w:hAnsiTheme="majorHAnsi" w:cstheme="majorBidi" w:ascii="Times New Roman" w:hAnsi="Times New Roman" w:eastAsia="Times New Roman"/>
       <w:b/>
       <w:bCs/>
       <w:i/>
       <w:iCs/>
       <w:color w:val="4F81BD" w:themeColor="accent1"/>
+      <w:sz w:val="26"/>
     </w:rPr>
   </w:style>
   <w:style w:type="paragraph" w:styleId="Heading5">
@@ -2810,11 +1244,11 @@
       <w:contextualSpacing/>
     </w:pPr>
     <w:rPr>
-      <w:rFonts w:asciiTheme="majorHAnsi" w:eastAsiaTheme="majorEastAsia" w:hAnsiTheme="majorHAnsi" w:cstheme="majorBidi"/>
+      <w:rFonts w:asciiTheme="majorHAnsi" w:eastAsiaTheme="majorEastAsia" w:hAnsiTheme="majorHAnsi" w:cstheme="majorBidi" w:ascii="Times New Roman" w:hAnsi="Times New Roman" w:eastAsia="Times New Roman"/>
       <w:color w:val="17365D" w:themeColor="text2" w:themeShade="BF"/>
       <w:spacing w:val="5"/>
       <w:kern w:val="28"/>
-      <w:sz w:val="52"/>
+      <w:sz w:val="34"/>
       <w:szCs w:val="52"/>
     </w:rPr>
   </w:style>

</xml_diff>

<commit_message>
data(c1a): G3 chạy lại với CV cỡ cụm 1,0 PI đã khai ⇒ DE 1,78 / N tối thiểu 808; SAP §1/§12 đồng bộ
Sau #149 (khoá CV chuẩn cluster_size_cv), run_g3_auto đọc đúng CV = 1,0 PI khai 14/10 (giả định lập kế
hoạch thận trọng, thay bằng CV thật từ HIS trước khi khoá SAP): DE Eldridge 2006 = 1,78, N trước bỏ cuộc
686, N tối thiểu 808 — khớp đề cương nộp Hội đồng (K5 ĐẠT). N kế hoạch 1.000 giữ nguyên (đủ tới CV ≈ 1,43).
- SAP §1 «N tối thiểu 808», §12 DE 1,78 + công thức + dòng CV; .docx dựng lại bằng xuat_docx_chuan.
- G4-AUTO-03 nay khớp G3 sống; G3/G4 chờ PI xác nhận lại (G3-HUMAN-06, G4-HUMAN-08: dấu vân tay đổi).
- GHI_CHU đề cương nộp mục 6: ghi phần đã đồng bộ, phần còn chờ PI/thống kê viên.
G10 KHÔNG lắp ở đây: worktree mới checkout dàn phẳng mtime ⇒ G10-AUTO-03 không đo được độ tươi; lắp
lại trên cây chính sau khi gộp.

Co-Authored-By: Claude Opus 5.5 <noreply@anthropic.com>
</commit_message>
<xml_diff>
--- a/exports/hai-long-benh-nhan-C1a-BVQY175/G3_A4_SAMPLE_SIZE_hai-long-benh-nhan-C1a-BVQY175.docx
+++ b/exports/hai-long-benh-nhan-C1a-BVQY175/G3_A4_SAMPLE_SIZE_hai-long-benh-nhan-C1a-BVQY175.docx
@@ -41,7 +41,7 @@
           <w:rFonts w:ascii="Times New Roman" w:hAnsi="Times New Roman" w:eastAsia="Times New Roman"/>
           <w:sz w:val="26"/>
         </w:rPr>
-        <w:t>**Mã:** hai-long-benh-nhan-C1a-BVQY175 | **Ngày sinh:** 2026-10-14 | **Trạng thái:** DRAFT — CHỜ BÁC SĨ XÁC NHẬN</w:t>
+        <w:t>**Mã:** hai-long-benh-nhan-C1a-BVQY175 | **Ngày sinh:** 2026-10-17 | **Trạng thái:** DRAFT — CHỜ BÁC SĨ XÁC NHẬN</w:t>
       </w:r>
     </w:p>
     <w:p>
@@ -144,7 +144,7 @@
           <w:rFonts w:ascii="Times New Roman" w:hAnsi="Times New Roman" w:eastAsia="Times New Roman"/>
           <w:sz w:val="26"/>
         </w:rPr>
-        <w:t>&gt; **Công thức:** Cỡ mẫu ước lượng một tỷ lệ theo độ chính xác (Lwanga &amp; Lemeshow/Cochran, xấp xỉ chuẩn): tỷ lệ hiện mắc ước lượng p=0.50, sai số cho phép d=0.05, alpha=0.05 Đã áp design effect cụm (DE=1+(m-1)×ICC=1.38, m=20, ICC=0.02): n 385 đến 532 (~27 cụm).</w:t>
+        <w:t>&gt; **Công thức:** Cỡ mẫu ước lượng một tỷ lệ theo độ chính xác (Lwanga &amp; Lemeshow/Cochran, xấp xỉ chuẩn): tỷ lệ hiện mắc ước lượng p=0.50, sai số cho phép d=0.05, alpha=0.05 Đã áp design effect cụm (DE=1+((CV²+1)m-1)×ICC, CV=1 — Eldridge 2006=1.78, m=20, ICC=0.02): n 385 đến 686 (~35 cụm).</w:t>
       </w:r>
     </w:p>
     <w:p>
@@ -192,7 +192,7 @@
           <w:rFonts w:ascii="Times New Roman" w:hAnsi="Times New Roman" w:eastAsia="Times New Roman"/>
           <w:sz w:val="26"/>
         </w:rPr>
-        <w:t>| N cần (chưa bù không trả lời) | **532** |</w:t>
+        <w:t>| N cần (chưa bù không trả lời) | **686** |</w:t>
       </w:r>
     </w:p>
     <w:p>
@@ -201,7 +201,7 @@
           <w:rFonts w:ascii="Times New Roman" w:hAnsi="Times New Roman" w:eastAsia="Times New Roman"/>
           <w:sz w:val="26"/>
         </w:rPr>
-        <w:t>| N điều chỉnh (15%) | **626** |</w:t>
+        <w:t>| N điều chỉnh (15%) | **808** |</w:t>
       </w:r>
     </w:p>
     <w:p>
@@ -210,7 +210,7 @@
           <w:rFonts w:ascii="Times New Roman" w:hAnsi="Times New Roman" w:eastAsia="Times New Roman"/>
           <w:sz w:val="26"/>
         </w:rPr>
-        <w:t>**KẾT LUẬN:** Nghiên cứu cần tuyển **626 người tham gia**.</w:t>
+        <w:t>**KẾT LUẬN:** Nghiên cứu cần tuyển **808 người tham gia**.</w:t>
       </w:r>
     </w:p>
     <w:p>
@@ -240,7 +240,7 @@
           <w:rFonts w:ascii="Times New Roman" w:hAnsi="Times New Roman" w:eastAsia="Times New Roman"/>
           <w:sz w:val="26"/>
         </w:rPr>
-        <w:t>[Đạt] **ĐẠT** — N chốt (1000) ≥ N tối thiểu tính theo thống kê (626), đủ hoặc dư lực thống kê/độ chính xác so với yêu cầu tối thiểu. Với N=1000 (giả định p=0.50, xấu nhất), sai số biên (margin of error) 95% CI ước lượng tỷ lệ ≈ ±3.1 điểm phần trăm — chặt hơn mức tối thiểu PHẦN 2 (N tối thiểu cho ±5%).</w:t>
+        <w:t>[Đạt] **ĐẠT** — N chốt (1000) ≥ N tối thiểu tính theo thống kê (808), đủ hoặc dư lực thống kê/độ chính xác so với yêu cầu tối thiểu. Với N=1000 (giả định p=0.50, xấu nhất), sai số biên (margin of error) 95% CI ước lượng tỷ lệ ≈ ±3.1 điểm phần trăm — chặt hơn mức tối thiểu PHẦN 2 (N tối thiểu cho ±5%).</w:t>
       </w:r>
     </w:p>
     <w:p>
@@ -270,7 +270,7 @@
           <w:rFonts w:ascii="Times New Roman" w:hAnsi="Times New Roman" w:eastAsia="Times New Roman"/>
           <w:sz w:val="26"/>
         </w:rPr>
-        <w:t>Bảng: tỷ lệ ước lượng p × sai số cho phép d đến N tối thiểu (TRƯỚC khi bù 15% không trả lời; đã nhân hiệu ứng thiết kế cụm DE = 1.38 (= 1+(m−1)×ICC, m = 20, ICC = 0.02))</w:t>
+        <w:t>Bảng: tỷ lệ ước lượng p × sai số cho phép d đến N tối thiểu (TRƯỚC khi bù 15% không trả lời; đã nhân hiệu ứng thiết kế cụm DE = 1.78 (= 1+(m−1)×ICC, m = 20, ICC = 0.02))</w:t>
       </w:r>
     </w:p>
     <w:p>
@@ -297,7 +297,7 @@
           <w:rFonts w:ascii="Times New Roman" w:hAnsi="Times New Roman" w:eastAsia="Times New Roman"/>
           <w:sz w:val="26"/>
         </w:rPr>
-        <w:t>| 0.10 | 765 | 192 | 49 |</w:t>
+        <w:t>| 0.10 | 987 | 248 | 63 |</w:t>
       </w:r>
     </w:p>
     <w:p>
@@ -306,7 +306,7 @@
           <w:rFonts w:ascii="Times New Roman" w:hAnsi="Times New Roman" w:eastAsia="Times New Roman"/>
           <w:sz w:val="26"/>
         </w:rPr>
-        <w:t>| 0.30 | 1782 | 446 | 112 |</w:t>
+        <w:t>| 0.30 | 2298 | 575 | 145 |</w:t>
       </w:r>
     </w:p>
     <w:p>
@@ -315,7 +315,7 @@
           <w:rFonts w:ascii="Times New Roman" w:hAnsi="Times New Roman" w:eastAsia="Times New Roman"/>
           <w:sz w:val="26"/>
         </w:rPr>
-        <w:t>| 0.50 (cơ sở) | 2122 | 532 | 134 |</w:t>
+        <w:t>| 0.50 (cơ sở) | 2736 | 686 | 173 |</w:t>
       </w:r>
     </w:p>
     <w:p>
@@ -363,7 +363,7 @@
           <w:rFonts w:ascii="Times New Roman" w:hAnsi="Times New Roman" w:eastAsia="Times New Roman"/>
           <w:sz w:val="26"/>
         </w:rPr>
-        <w:t>Cỡ mẫu được tính theo Cỡ mẫu ước lượng một tỷ lệ theo độ chính xác (Lwanga &amp; Lemeshow/Cochran, xấp xỉ chuẩn): tỷ lệ hiện mắc ước lượng p=0.50, sai số cho phép d=0.05, alpha=0.05 Đã áp design effect cụm (DE=1+(m-1)×ICC=1.38, m=20, ICC=0.02): n 385 đến 532 (~27 cụm)..</w:t>
+        <w:t>Cỡ mẫu được tính theo Cỡ mẫu ước lượng một tỷ lệ theo độ chính xác (Lwanga &amp; Lemeshow/Cochran, xấp xỉ chuẩn): tỷ lệ hiện mắc ước lượng p=0.50, sai số cho phép d=0.05, alpha=0.05 Đã áp design effect cụm (DE=1+((CV²+1)m-1)×ICC, CV=1 — Eldridge 2006=1.78, m=20, ICC=0.02): n 385 đến 686 (~35 cụm)..</w:t>
       </w:r>
     </w:p>
     <w:p>
@@ -390,7 +390,7 @@
           <w:rFonts w:ascii="Times New Roman" w:hAnsi="Times New Roman" w:eastAsia="Times New Roman"/>
           <w:sz w:val="26"/>
         </w:rPr>
-        <w:t>cần 532 người.</w:t>
+        <w:t>cần 686 người.</w:t>
       </w:r>
     </w:p>
     <w:p>
@@ -399,7 +399,7 @@
           <w:rFonts w:ascii="Times New Roman" w:hAnsi="Times New Roman" w:eastAsia="Times New Roman"/>
           <w:sz w:val="26"/>
         </w:rPr>
-        <w:t>Tính thêm 15% không trả lời dự kiến, cỡ mẫu cuối = 626 người.</w:t>
+        <w:t>Tính thêm 15% không trả lời dự kiến, cỡ mẫu cuối = 808 người.</w:t>
       </w:r>
     </w:p>
     <w:p>

</xml_diff>